<commit_message>
Tighten paper and summary: cut repeated/doubled phrasing
Remove redundant restatements and triadic example padding throughout (e.g. the
doubled 'hidden protocol... a reading that lies' passage folded into one clean
sentence); fix the stale version range in the summary. Same substance, facts,
tables, and voice - just less of it. Regenerate both .docx.

Co-Authored-By: Claude Opus 4.8 <noreply@anthropic.com>
</commit_message>
<xml_diff>
--- a/docs/starlink-monitor-case-study.docx
+++ b/docs/starlink-monitor-case-study.docx
@@ -79,7 +79,7 @@
     </w:p>
     <w:p>
       <w:r>
-        <w:t>This is a second case study in building a working tool by talking to a coding agent, and a chance to put a pattern from the first one to the test. The artifact is a standalone Python desktop dashboard that monitors a Starlink dish in real time over the dish's local gRPC interface, with live link metrics, a satellite sky map, GPS, on-disk logging, and a firmware guard; it was produced, as the prior project was, entirely by direction in plain language, with the human author writing none of the source. I am a marine instrumentation engineer, not a programmer. The unusual part is again a single class of non-obvious fact, only here it is sharper than a mislabeled protocol: the dish answers an undocumented gRPC API whose field numbers are shifted from the community-documented spec and, worse, several of its readings are actively misleading - a history buffer that looks like signal-to-noise but is not, a number that looks like an obstruction score but tracks something else, a panel that looks live but is frozen. None of this could be specified up front, because none of it was known; each was settled only by wire-decoding the raw bytes and checking the result against ground truth. "Validate your assumptions early." I treat the conversation as data a second time, condense roughly two dozen exchanges into a classified table, and then do something the first paper could only propose: I take the Domain-Expert Specification (DES) schema from that paper and ask whether it actually fits a different device, a different protocol, and a far larger artifact. It mostly does, with one honest seam I will name. I again put numbers on effort - a few hours of active attention against a three-point estimate near 40 person-hours for an unaided professional, and a different regime entirely for a non-programmer alone. One case again, observed and not controlled; the schema remains a hypothesis, now with a second data point rather than a proof.</w:t>
+        <w:t>This is a second case study in building a working tool by directing a coding agent, and a chance to test a pattern proposed in the first. The artifact is a standalone Python desktop dashboard that monitors a Starlink dish over its local gRPC interface, with live link metrics, a satellite sky map, GPS, on-disk logging, and a firmware guard; as before, I specified it in plain language and wrote none of the source. I am a marine instrumentation engineer, not a programmer. The hard part is again a single class of non-obvious fact, sharper here than a mislabeled protocol: the dish answers an undocumented gRPC API whose field numbers are shifted from the community spec and, worse, several readings are actively misleading - a buffer that looks like signal-to-noise but is not, a number that reads like an obstruction score but tracks something else, a panel that looks live but is frozen. None of it could be specified up front because none of it was known; each was settled only by wire-decoding the bytes and checking against ground truth. I again read the transcript as data, classify the turns, and then do what the first paper could only propose: I take the Domain-Expert Specification (DES) schema and ask whether it fits a different device, protocol, and a far larger artifact. Six of its seven slots transfer cleanly; the one seam is a data-handling concern the schema does not name. I again bound effort - a few hours of active attention against a three-point estimate near 40 person-hours for an unaided professional, and a different regime entirely for a non-programmer alone. One case again, observed and not controlled; the schema remains a hypothesis, now with a second data point.</w:t>
       </w:r>
     </w:p>
     <w:p>
@@ -108,12 +108,12 @@
     </w:p>
     <w:p>
       <w:r>
-        <w:t>The first paper in this small series described a field practitioner specifying an operational tool in plain language and an agent building, debugging, hardening, and publishing it. It ended with a proposal rather than a result: a seven-slot prompting schema, the Domain-Expert Specification, offered as a hypothesis about how people who know their gear but not their compiler could get to a correct artifact in fewer passes. A hypothesis with one supporting case is a story, not a finding. This paper adds a second case, deliberately chosen to be different in almost every dimension that matters - a different device, a network protocol that is documented but wrong rather than simply hidden, and an artifact perhaps three times the size - and asks whether the same division of labor and the same schema hold up when the work is bigger and the discovery is harder.</w:t>
+        <w:t>The first paper in this series described a practitioner specifying an operational tool in plain language and an agent building, debugging, hardening, and publishing it. It ended with a proposal rather than a result: a seven-slot prompting schema, the Domain-Expert Specification, offered as a hypothesis about how people who know their gear but not their compiler might reach a correct artifact in fewer passes. A hypothesis with one supporting case is a story, not a finding. This paper adds a second case, chosen to differ in nearly every dimension that matters - a different device, a protocol that is documented but wrong rather than merely hidden, and an artifact perhaps three times the size - and asks whether the same division of labor and the same schema hold up.</w:t>
       </w:r>
     </w:p>
     <w:p>
       <w:r>
-        <w:t>The setting is marine. A Starlink terminal is now the default over-the-horizon link on a working vessel or an uncrewed surface vehicle, and when the link degrades at sea you want to know why, locally, without an account login or a phone app that assumes a human is standing next to the dish. I asked for a tool that watches the dish on the local network and shows me what it is doing. What came back, after roughly two dozen turns spread over two sessions, was a published desktop application with a live link view, a moving map of the satellites overhead, a GPS feed, telemetry logging, and a guard that warns me when the dish updates its own firmware out from under the field mappings the tool depends on. My aims are the two from before. Record the artifact honestly, including the part that was genuinely hard. Then read the transcript as evidence, and this time hold it up against the schema the last paper proposed, to see what survives contact with a second case.</w:t>
+        <w:t>The setting is marine. A Starlink terminal is now the default over-the-horizon link on a working vessel or an uncrewed surface vehicle, and when the link degrades at sea you want to know why, locally, without an account login. I asked for a tool that watches the dish on the local network and shows me what it is doing. What came back, over roughly two dozen turns across two sessions, was a published desktop application with a live link view, a moving map of the satellites overhead, a GPS feed, telemetry logging, and a guard that warns me when the dish updates its own firmware out from under the field mappings the tool depends on. My aims are the two from before: record the artifact honestly, including the part that was genuinely hard, then read the transcript against the schema the last paper proposed and see what survives a second case.</w:t>
       </w:r>
     </w:p>
     <w:p>
@@ -149,17 +149,17 @@
         <w:t>9200</w:t>
       </w:r>
       <w:r>
-        <w:t>, with no authentication. That much is community knowledge. The trap is in the details, and it has two layers.</w:t>
+        <w:t>, with no authentication. That much is community knowledge. The trap has two layers.</w:t>
       </w:r>
     </w:p>
     <w:p>
       <w:r>
-        <w:t>The first layer is ordinary reverse engineering. The service is undocumented by SpaceX, and the field numbers that community tools once relied on no longer match: in the firmware this dish runs, the telemetry fields sit roughly a thousand higher than the legacy spec, and they are not stable across firmware. So the agent rebuilt the schema from the wire. It compiled a protobuf definition at runtime from a string embedded in the program, called the status and history methods, serialized the replies back to bytes, and walked the wire format by hand - field number, wire type, value - until each reading lined up with something physical. Tedious, but mechanical. Off-the-shelf field maps do not survive a firmware bump; a decoder does.</w:t>
+        <w:t>The first is ordinary reverse engineering. The service is undocumented, and the field numbers community tools once relied on no longer match: in this firmware the telemetry fields sit roughly a thousand higher than the legacy spec, and they are not stable across firmware. So the agent rebuilt the schema from the wire - compiling a protobuf at runtime, calling the status and history methods, and walking the raw bytes until each reading lined up with something physical. Tedious but mechanical; off-the-shelf field maps do not survive a firmware bump, but a decoder does.</w:t>
       </w:r>
     </w:p>
     <w:p>
       <w:r>
-        <w:t>The second layer is the one I want to dwell on, because it is the project's real lesson and it is worse than a hidden protocol. Several of the dish's readings are not hidden at all. They are present, plausible, and wrong, and only watching them over time or against an independent truth exposes them:</w:t>
+        <w:t>The second layer is the real lesson, and it is worse than a hidden protocol: several readings are not hidden at all, but present, plausible, and wrong, exposed only by watching them over time or against an independent truth.</w:t>
       </w:r>
     </w:p>
     <w:p>
@@ -167,7 +167,7 @@
         <w:pStyle w:val="ListBullet"/>
       </w:pPr>
       <w:r>
-        <w:t>A packed history buffer decodes cleanly as floating-point numbers in a believable range, and the obvious reading is "signal-to-noise history." It is not. Watched against the live SNR the dish streams (steady near 16 to 20 dB), the buffer ran from 16 to 89 with a mean around 32. An SNR of 89 dB is not a thing. The buffer is some other quantity; seeding the SNR chart from it was quietly showing fiction, and the only way to catch it was to put the buffered series next to the streamed one and notice they did not agree.</w:t>
+        <w:t>A packed history buffer decodes as believable floats, and the obvious reading is "SNR history." It is not: against the live SNR the dish streams (steady near 16 to 20 dB), the buffer ran 16 to 89 with a mean near 32, and an SNR of 89 dB is not a thing. Seeding the SNR chart from it was showing fiction.</w:t>
       </w:r>
     </w:p>
     <w:p>
@@ -175,7 +175,7 @@
         <w:pStyle w:val="ListBullet"/>
       </w:pPr>
       <w:r>
-        <w:t>A field decodes as a tidy number between 0 and 1 and sits exactly where you would expect an "obstruction score." Reported as one, it made no sense: it read high while the sky was provably clear, and it swung from 0.62 to 0.44 between two polls seconds apart. Real obstruction does not do that. It is an alignment or uncertainty metric wearing an obstruction's clothes; the genuine obstruction signal lives elsewhere and, on this firmware, the boolean that ought to carry it is itself unreliable, reading "obstructed" under an open sky.</w:t>
+        <w:t>A field decodes as a tidy number between 0 and 1, exactly where an "obstruction score" belongs. Reported as one it made no sense: it read high under a provably clear sky and swung from 0.62 to 0.44 between polls seconds apart. Real obstruction does not do that; the field is an alignment metric, and the boolean that ought to carry obstruction is itself unreliable on this firmware.</w:t>
       </w:r>
     </w:p>
     <w:p>
@@ -183,12 +183,12 @@
         <w:pStyle w:val="ListBullet"/>
       </w:pPr>
       <w:r>
-        <w:t>A ten-value array looked like a live per-sector signal map. It never moved. Polled eight times across fourteen seconds while throughput and SNR changed normally, it returned byte-for-byte identical values every time. The array is real, but it is a slowly-accumulated sky scan that shifts over hours, not a per-second reading. Captured once and ignored? No. Read every poll, redrawn every poll, and simply constant at the source. The fix was not code; it was relabeling the thing as what it actually is.</w:t>
+        <w:t>A ten-value array looked like a live per-sector signal map but never moved - byte-for-byte identical across eight polls in fourteen seconds while throughput and SNR changed normally. It is a slowly-accumulated sky scan that shifts over hours, not a per-second reading; the fix was relabeling it as what it is.</w:t>
       </w:r>
     </w:p>
     <w:p>
       <w:r>
-        <w:t>I dwell on these because they are the heart of the matter. A hidden protocol you can find by trying harder. A reading that is present and lies to you, you can only catch by distrusting it - by setting it beside a streamed value, or a clear sky, or the same field one poll later, and watching for the contradiction. I could not have told the agent any of this up front. I did not know it, and the published field maps did not either. It had to be discovered, by probing the box and refusing to believe the first plausible answer, and discovery of that kind is a capability no wording on my end can supply.</w:t>
+        <w:t>A hidden protocol you find by trying harder; a reading that lies you catch only by distrusting it, setting it beside a streamed value or a clear sky and watching for the contradiction. I could not have told the agent any of this up front: I did not know it, and the published field maps did not either. It had to be discovered by probing the box and refusing the first plausible answer, and that kind of discovery is a capability no wording on my end can supply.</w:t>
       </w:r>
     </w:p>
     <w:p>
@@ -224,7 +224,7 @@
         <w:t>sgp4</w:t>
       </w:r>
       <w:r>
-        <w:t xml:space="preserve"> and </w:t>
+        <w:t xml:space="preserve">, </w:t>
       </w:r>
       <w:r>
         <w:rPr>
@@ -233,12 +233,12 @@
         <w:t>numpy</w:t>
       </w:r>
       <w:r>
-        <w:t>) used only by the satellite features and degraded gracefully when absent. One file keeps deployment on a vessel's console painless, which is the same instinct that drove the previous project's zero-dependency choice.</w:t>
+        <w:t>) used only by the satellite features and skipped gracefully when absent. One file keeps deployment on a vessel's console painless.</w:t>
       </w:r>
     </w:p>
     <w:p>
       <w:r>
-        <w:t>It does several jobs at once. A client layer speaks the dish's gRPC dialect: it compiles the embedded protobuf at runtime - no build step, so a field map can be corrected with a one-line edit and a relaunch - polls status every two seconds on a background thread, and marshals results to the interface safely. A main window shows the live link: download and upload, latency, packet loss, and SNR, each with a rolling sparkline, a twenty-minute throughput history with a hundred-sample moving mean, a status panel, and a location panel that pairs an IP-derived ground-station estimate with the dish's own GPS position, a distance between them, and a live scroll of the raw NMEA sentences off a serial GPS. A detail window adds a satellite sky map: a top-down, dish-centered map drawn with real coastlines and state and country borders, every Starlink satellite's ground point plotted from public two-line elements and propagated with SGP4 so the field moves in real time, the dish's most-likely satellite highlighted with a line to it, a fixed-scale view, a range ring, and a north indicator (Figure 1). Below it sit a per-sector map, a plain-language readout of the dish's subsystem-ready flags, dish information including the firmware version and tilt, and an extended-info panel. Every poll is appended to a daily CSV, schema-versioned so a new column never corrupts a day's file. And a firmware check compares the dish's reported build against the one the field mappings were verified on, turning the panel amber with a warning on a mismatch while continuing to run.</w:t>
+        <w:t>A client layer speaks the dish's gRPC dialect: it compiles the embedded protobuf at runtime (no build step, so a field map is a one-line edit and a relaunch), polls status every two seconds on a background thread, and marshals results to the interface safely. A main window shows the live link - download and upload, latency, packet loss, SNR, each with a sparkline - a twenty-minute throughput history with a hundred-sample mean, a status panel, and a location panel pairing an IP-derived ground-station estimate with the dish's GPS position, the distance between them, and a live scroll of the raw NMEA sentences. A detail window adds a satellite sky map: a top-down, dish-centered map drawn with real coastlines and borders, every Starlink satellite's ground point propagated with SGP4 so the field moves, the likely satellite highlighted, a fixed scale, a range ring, and a north indicator (Figure 1). Below it sit a per-sector map, a plain-language readout of the subsystem-ready flags, dish information including firmware and tilt, and extended info. Every poll appends to a daily CSV, schema-versioned so a new column never corrupts a day's file. A firmware check compares the dish's reported build against the one the mappings were verified on, turning the panel amber with a warning on a mismatch while continuing to run - which it earned in §4.</w:t>
       </w:r>
     </w:p>
     <w:p>
@@ -289,11 +289,6 @@
       </w:r>
     </w:p>
     <w:p>
-      <w:r>
-        <w:t>That last feature earned its keep during the project, which I will return to in §4.</w:t>
-      </w:r>
-    </w:p>
-    <w:p>
       <w:pPr>
         <w:keepNext/>
         <w:spacing w:before="240" w:after="120"/>
@@ -308,7 +303,7 @@
     </w:p>
     <w:p>
       <w:r>
-        <w:t xml:space="preserve">The tool came together over roughly two dozen user turns across two working sessions. Table 1 condenses the significant ones and labels each by what it was doing, using the same taxonomy as the first paper: </w:t>
+        <w:t xml:space="preserve">The tool came together over roughly two dozen turns across two sessions. Table 1 condenses the significant ones and labels each by function, using the first paper's taxonomy: </w:t>
       </w:r>
       <w:r>
         <w:rPr>
@@ -317,7 +312,7 @@
         <w:t>specification</w:t>
       </w:r>
       <w:r>
-        <w:t xml:space="preserve"> (states a requirement), </w:t>
+        <w:t xml:space="preserve">, </w:t>
       </w:r>
       <w:r>
         <w:rPr>
@@ -326,7 +321,7 @@
         <w:t>authorization</w:t>
       </w:r>
       <w:r>
-        <w:t xml:space="preserve"> (grants permission), </w:t>
+        <w:t xml:space="preserve">, </w:t>
       </w:r>
       <w:r>
         <w:rPr>
@@ -335,7 +330,7 @@
         <w:t>defect report</w:t>
       </w:r>
       <w:r>
-        <w:t xml:space="preserve"> (flags a fault), </w:t>
+        <w:t xml:space="preserve">, </w:t>
       </w:r>
       <w:r>
         <w:rPr>
@@ -344,7 +339,7 @@
         <w:t>feature</w:t>
       </w:r>
       <w:r>
-        <w:t xml:space="preserve"> (adds scope), </w:t>
+        <w:t xml:space="preserve">, </w:t>
       </w:r>
       <w:r>
         <w:rPr>
@@ -353,7 +348,7 @@
         <w:t>packaging</w:t>
       </w:r>
       <w:r>
-        <w:t xml:space="preserve"> (distribution and structure), </w:t>
+        <w:t xml:space="preserve">, </w:t>
       </w:r>
       <w:r>
         <w:rPr>
@@ -362,7 +357,7 @@
         <w:t>deferral</w:t>
       </w:r>
       <w:r>
-        <w:t xml:space="preserve"> (marks a value as later-bound), </w:t>
+        <w:t xml:space="preserve">, </w:t>
       </w:r>
       <w:r>
         <w:rPr>
@@ -371,7 +366,7 @@
         <w:t>context</w:t>
       </w:r>
       <w:r>
-        <w:t xml:space="preserve"> (supplies domain framing), and </w:t>
+        <w:t xml:space="preserve">, and </w:t>
       </w:r>
       <w:r>
         <w:rPr>
@@ -380,7 +375,7 @@
         <w:t>constraint</w:t>
       </w:r>
       <w:r>
-        <w:t xml:space="preserve"> (bounds how the work is done). I have folded a number of small layout and packaging turns into the rows below; the full transcript is longer than the table.</w:t>
+        <w:t>. Small layout and packaging turns are folded into the rows; the full transcript is longer than the table.</w:t>
       </w:r>
     </w:p>
     <w:p>
@@ -1821,7 +1816,7 @@
     </w:tbl>
     <w:p>
       <w:r>
-        <w:t>Three turns deserve a closer look, because they fall on the line the first paper drew: the difference between a defect of specification and a defect of implementation or knowledge.</w:t>
+        <w:t>Three turns fall on the line between a defect of specification and one of implementation or knowledge.</w:t>
       </w:r>
     </w:p>
     <w:p>
@@ -1832,7 +1827,7 @@
         <w:t>Turn 11, a knowledge defect surfaced by distrust.</w:t>
       </w:r>
       <w:r>
-        <w:t xml:space="preserve"> I told the agent the SNR chart "appeared to lock up" and, later, that the obstruction score "makes no sense" against a clear sky. Neither report was clever, and neither needed to be. They were the judgment I do have: the picture on the screen disagreed with the weather and with the live number beside it. From those two complaints the agent went back to the wire, put the buffered series next to the streamed SNR, polled the obstruction field repeatedly and watched it swing, and concluded that both fields had been mismapped - not by us alone, but by the community spec it inherited. This is the analog of the previous project's hidden Modbus dialect, and it is irreducible in the same way: it rode on runtime evidence nobody had until the box was watched. What I supplied was not the answer but the suspicion, and the suspicion is exactly what a domain expert carries. I know what a clear sky looks like.</w:t>
+        <w:t xml:space="preserve"> I reported that the SNR chart "appeared to lock up" and that the obstruction score "makes no sense" against a clear sky. Neither report was clever, and neither needed to be: the screen disagreed with the weather and with the live number beside it. From those two complaints the agent went back to the wire, set the buffered series next to the streamed SNR, polled the obstruction field and watched it swing, and found both had been mismapped by the spec it inherited. This is the analog of the first project's hidden Modbus dialect, irreducible in the same way - it rode on runtime evidence nobody had. I supplied not the answer but the suspicion, and the suspicion is what a domain expert carries.</w:t>
       </w:r>
     </w:p>
     <w:p>
@@ -1840,10 +1835,10 @@
         <w:rPr>
           <w:b/>
         </w:rPr>
-        <w:t>Turn 14, reliability that the field then exercised for real.</w:t>
+        <w:t>Turn 14, reliability the field then exercised for real.</w:t>
       </w:r>
       <w:r>
-        <w:t xml:space="preserve"> I asked for a firmware check: compare the dish's build to the one the mappings were verified against, warn on a mismatch, keep running. A sensible guard, written against a hypothetical. Days later the hypothetical happened - the dish updated itself over the air, from one build to a newer one - and the guard did precisely its job: it turned the firmware line amber, posted the warning, and kept running while I checked that the readings still agreed with reality. They did, so we promoted the new build to "known" and moved on. I like this turn because the requirement came from the destination rather than from a present bug: a dish in the field updates on its own schedule, and a tool that silently trusts stale field numbers will lie to you the day that happens. Stating that as a requirement on day one was possible. I did not, but I could have.</w:t>
+        <w:t xml:space="preserve"> I asked for a firmware check: compare the dish's build to the verified one, warn on a mismatch, keep running. A sensible guard against a hypothetical. Days later the dish updated itself over the air, the guard turned the firmware line amber and kept running, the readings still agreed with reality, and we promoted the new build to "known." The requirement came from the destination rather than a present bug - a dish in the field updates on its own schedule, and a tool that silently trusts stale field numbers will lie the day it does.</w:t>
       </w:r>
     </w:p>
     <w:p>
@@ -1854,7 +1849,7 @@
         <w:t>Turn 7, a specification that hit a wall the agent diagnosed.</w:t>
       </w:r>
       <w:r>
-        <w:t xml:space="preserve"> I asked, mid-project, to rebuild the whole thing against Starlink's V2 service-account API, and handed over a client id and secret. The agent took the credential, authenticated, and then found that the token it minted was scoped to the consumer tier and could not reach the telemetry endpoints at all - every enterprise route refused it. So the answer to "recode against the cloud API" turned out to be "you cannot, with this credential," established empirically and quickly, and we reverted. Two things are worth noting. The dead end was found by trying, not by guessing. And the agent, unprompted, kept the secret out of the source and out of the public repository and later flagged that it should be rotated, which is the kind of safety reflex I want and would not reliably have specified.</w:t>
+        <w:t xml:space="preserve"> I asked, mid-project, to rebuild against Starlink's V2 service-account API, and handed over a client id and secret. The agent authenticated and found the token scoped to the consumer tier, unable to reach the telemetry endpoints; "recode against the cloud API" became "you cannot, with this credential," established empirically, and we reverted. The dead end was found by trying, not guessing - and the agent, unprompted, kept the secret out of the source and the public repository and flagged that it should be rotated.</w:t>
       </w:r>
     </w:p>
     <w:p>
@@ -1872,7 +1867,7 @@
     </w:p>
     <w:p>
       <w:r>
-        <w:t>The central question repeats. Of the turns in Table 1, which supplied something that was latent in my first intent and could have been hoisted into the opening pass, and which were genuinely irreducible?</w:t>
+        <w:t>Of the turns in Table 1, which were latent in my first intent and could have been hoisted into the opening pass, and which were genuinely irreducible?</w:t>
       </w:r>
     </w:p>
     <w:p>
@@ -1883,7 +1878,7 @@
         <w:t>The irreducible ones.</w:t>
       </w:r>
       <w:r>
-        <w:t xml:space="preserve"> Turn 1 (the seed) and turn 18 (this paper) are required by definition. Turn 11's discovery - that two fields were mismapped - could only surface once the artifact existed, ran, and was watched against ground truth; no wording could have pre-empted a fact nobody held. The same is true of the protocol work behind turn 1, and of the cloud-API dead end in turn 7, which rode on the runtime fact that the credential was the wrong tier. These are discovery, and discovery is the agent's to do.</w:t>
+        <w:t xml:space="preserve"> Turn 1 (the seed) and turn 18 (this paper) are required by definition. Turn 11's discovery could only surface once the artifact ran and was watched against ground truth; the same holds for the protocol work behind turn 1 and the wrong-tier credential in turn 7. These are discovery, and discovery is the agent's to do.</w:t>
       </w:r>
     </w:p>
     <w:p>
@@ -1894,7 +1889,7 @@
         <w:t>The avoidable ones.</w:t>
       </w:r>
       <w:r>
-        <w:t xml:space="preserve"> A familiar list of turns each named something that was in my intent from the start but only got said once its absence was in front of me. The GPS source and feed (turns 2, 12) were always part of "monitor the dish on a vessel," where position and a serial GPS are routine. The satellite map (turns 9, 16) was where "see what the dish is doing" was always heading; the opening request said only "a dashboard." Publishing, packaging, and the knowledge bundle (turns 5, 17) were the intended destination, not an afterthought. And the firmware guard (turn 14) follows directly from the deployment: a dish in the field updates itself, so a tool that depends on firmware-specific field numbers must notice when the firmware changes. That could have been a non-functional requirement on day one.</w:t>
+        <w:t xml:space="preserve"> The GPS source and feed (turns 2, 12), the satellite map (turns 9, 16), publishing and the knowledge bundle (turns 5, 17), and the firmware guard (turn 14) each named something already in my intent but said only once its absence was in front of me. The firmware guard is the clearest: a dish in the field updates itself, so a tool keyed to firmware-specific field numbers must notice when the firmware changes - a non-functional requirement available on day one.</w:t>
       </w:r>
     </w:p>
     <w:p>
@@ -1916,12 +1911,12 @@
         <w:rPr>
           <w:i/>
         </w:rPr>
-        <w:t>Build a standalone, publishable desktop tool to monitor a Starlink dish over its local gRPC interface at 192.168.100.1, for use on a vessel or an uncrewed surface vehicle. I am not a programmer; deliver a single self-contained program I can run with minimal setup. Show the live link - throughput, latency, loss, SNR - with short histories, the dish's pointing and obstruction state, its GPS position from a serial NMEA receiver with the raw feed visible, and a map of the satellites overhead derived from public orbital elements, with the likely connected satellite highlighted. Log everything to disk for later study. The dish is undocumented and updates its own firmware in the field, so determine the telemetry field numbers empirically rather than trusting any published map, distrust any reading that disagrees with physical reality, and warn me - without stopping - when the firmware changes out from under those mappings. Where I supply a credential or a value, treat it as sensitive and keep it out of the published repository. Package it as its own public GitHub repository with a README, an open-source license, and screenshots.</w:t>
+        <w:t>Build a standalone, publishable desktop tool to monitor a Starlink dish over its local gRPC interface at 192.168.100.1, for use on a vessel or an uncrewed surface vehicle. I am not a programmer; deliver a single self-contained program I can run with minimal setup. Show the live link - throughput, latency, loss, SNR - with short histories, the dish's pointing and obstruction state, its GPS position from a serial NMEA receiver with the raw feed visible, and a map of the satellites overhead from public orbital elements, with the likely connected satellite highlighted. Log everything to disk. The dish is undocumented and updates its own firmware in the field, so determine the telemetry field numbers empirically rather than trusting any published map, distrust any reading that disagrees with physical reality, and warn me, without stopping, when the firmware changes out from under those mappings. Treat any credential or value I supply as sensitive and keep it out of the published repository. Package it as its own public GitHub repository with a README, an open-source license, and screenshots.</w:t>
       </w:r>
     </w:p>
     <w:p>
       <w:r>
-        <w:t>I offer this, as before, not as a reproach to how the real conversation went. Discovering your own requirements as you go is normal and often efficient, and a few of these I genuinely could not have judged before an artifact made the trade-off concrete. I offer it as evidence that a sizable share of the turns were latent in the first intent, and so, in principle, could have been moved to the front.</w:t>
+        <w:t>I offer this not as a reproach to how the conversation went. Discovering your own requirements as you go is normal and often efficient, and a few of these I could not have judged before an artifact made the trade-off concrete. I offer it as evidence that a sizable share of the turns were latent in the first intent, and so could have been moved to the front.</w:t>
       </w:r>
     </w:p>
     <w:p>
@@ -1939,7 +1934,7 @@
     </w:p>
     <w:p>
       <w:r>
-        <w:t>The first paper proposed the DES schema and could only argue that it would have helped. Here I can do better: apply it after the fact to a genuinely different project and see where it fits and where it strains. The schema has seven slots; I take them in turn, with this project's content, and grade each.</w:t>
+        <w:t>The first paper proposed the DES schema and could only argue it would help. Here I apply it after the fact to a different project and grade each of its seven slots.</w:t>
       </w:r>
     </w:p>
     <w:p>
@@ -1962,13 +1957,13 @@
         <w:t>192.168.100.1</w:t>
       </w:r>
       <w:r>
-        <w:t xml:space="preserve"> on the local network, speaking gRPC. </w:t>
+        <w:t xml:space="preserve">, speaking gRPC. </w:t>
       </w:r>
       <w:r>
         <w:rPr>
           <w:i/>
         </w:rPr>
-        <w:t>Fits cleanly. I knew the address and the transport precisely, and naming them pointed the agent straight at the right surface; the protocol hunt was bounded from the first line.</w:t>
+        <w:t>Fits. Naming the address and transport pointed the agent at the right surface and bounded the protocol hunt from the first line.</w:t>
       </w:r>
     </w:p>
     <w:p>
@@ -1982,13 +1977,13 @@
         <w:t>Operational repertoire.</w:t>
       </w:r>
       <w:r>
-        <w:t xml:space="preserve"> Watch the link metrics, the pointing and obstruction state, the GPS position, the satellites overhead; log it; survive a firmware change. </w:t>
+        <w:t xml:space="preserve"> Watch the link metrics, pointing and obstruction, GPS, the satellites overhead; log it; survive a firmware change. </w:t>
       </w:r>
       <w:r>
         <w:rPr>
           <w:i/>
         </w:rPr>
-        <w:t>Fits, and it is again the slot I under-filled - the satellite map and the logging were latent, not stated. It is also again the slot I am best placed to fill completely, because it is just the watch-standing I want written down.</w:t>
+        <w:t>Fits, and again the slot I under-filled - the map and the logging were latent. It is also the one I am best placed to fill, being just the watch I want written down.</w:t>
       </w:r>
     </w:p>
     <w:p>
@@ -2002,13 +1997,13 @@
         <w:t>Field context and deployment.</w:t>
       </w:r>
       <w:r>
-        <w:t xml:space="preserve"> A vessel or an uncrewed surface vehicle, an over-the-horizon link that matters operationally and degrades without warning. </w:t>
+        <w:t xml:space="preserve"> A vessel or USV, an over-the-horizon link that matters operationally and degrades without warning. </w:t>
       </w:r>
       <w:r>
         <w:rPr>
           <w:i/>
         </w:rPr>
-        <w:t>Fits, and it does real work: "the dish updates itself in the field" is a deployment fact, and it licenses the firmware guard of turn 14 as a non-functional requirement.</w:t>
+        <w:t>Fits, and it does real work: "the dish updates itself in the field" licenses the firmware guard.</w:t>
       </w:r>
     </w:p>
     <w:p>
@@ -2022,13 +2017,13 @@
         <w:t>Authorization and safety envelope.</w:t>
       </w:r>
       <w:r>
-        <w:t xml:space="preserve"> Here is the first strain, and it is instructive. In the previous project this slot meant "you may switch the relays, nothing is connected." Here the dish is live and load-bearing, so there was nothing to authorize - reads are safe and writes were never in scope. The slot did not so much fail as fall idle. </w:t>
+        <w:t xml:space="preserve"> Here is the strain. In the first project this meant "you may switch the relays, nothing is connected"; here the dish is live and read-only, so there was nothing to authorize and the slot fell idle. </w:t>
       </w:r>
       <w:r>
         <w:rPr>
           <w:i/>
         </w:rPr>
-        <w:t>Mostly not applicable to a read-only instrument; the safety envelope that did matter was about my data, not the device, which slot 4 does not quite name (more on this below).</w:t>
+        <w:t>Mostly not applicable to a read-only instrument - and the safety concern that did matter was my data, which slot 4 does not name (see below).</w:t>
       </w:r>
     </w:p>
     <w:p>
@@ -2042,13 +2037,13 @@
         <w:t>Deferred parameters.</w:t>
       </w:r>
       <w:r>
-        <w:t xml:space="preserve"> The known firmware build, and earlier the GPS port, were values that change with the hardware in front of you. </w:t>
+        <w:t xml:space="preserve"> The verified firmware build, and earlier the GPS port. </w:t>
       </w:r>
       <w:r>
         <w:rPr>
           <w:i/>
         </w:rPr>
-        <w:t>Fits. Naming the firmware build as a verified-against constant, rather than a hard assumption, is exactly the deferral slot 5 is for, and it is what made the firmware guard possible instead of a silent breakage.</w:t>
+        <w:t>Fits. Naming the firmware build as a verified-against constant, not a hard assumption, is what made the guard possible instead of a silent breakage.</w:t>
       </w:r>
     </w:p>
     <w:p>
@@ -2068,7 +2063,7 @@
         <w:rPr>
           <w:i/>
         </w:rPr>
-        <w:t>Fits, and stating it first would again have collapsed several packaging turns into the opening pass.</w:t>
+        <w:t>Fits, and stating it first would have collapsed several packaging turns into the opening pass.</w:t>
       </w:r>
     </w:p>
     <w:p>
@@ -2082,18 +2077,18 @@
         <w:t>Verification expectation.</w:t>
       </w:r>
       <w:r>
-        <w:t xml:space="preserve"> Verify against reality - the streamed value, the clear sky, the same field one poll later - and, where ground truth is thin, against an independent model. </w:t>
+        <w:t xml:space="preserve"> Verify against reality - the streamed value, the clear sky, the same field one poll later - and against an independent model where ground truth is thin. </w:t>
       </w:r>
       <w:r>
         <w:rPr>
           <w:i/>
         </w:rPr>
-        <w:t>Fits, and it is the slot that earned the most here. The satellite math was checked against an independent ephemeris library to a fraction of a degree; the mismapped fields were caught precisely by holding a reading against a streamed truth. This slot turns "make it work" into "show me it agrees with the world," which is the whole game when the device's own readings cannot be trusted.</w:t>
+        <w:t>Fits, and it earned the most here: the satellite math was checked against an independent ephemeris library to a fraction of a degree, and the mismapped fields were caught by holding a reading against a streamed truth. This slot is the whole game when the device's own readings cannot be trusted.</w:t>
       </w:r>
     </w:p>
     <w:p>
       <w:r>
-        <w:t>So six of seven slots transfer to a very different project without modification, which is more than I expected, and the schema's core refusal - do not ask the user for implementation - held: I specified no field numbers, no projection math, no threading model, and those are exactly the parts that had to be discovered or engineered. The one seam is slot 4. On a read-only instrument the device-authorization framing goes slack, while a different safety concern - the handling of a credential I pasted into the conversation - turned out to matter and is not what slot 4 was built to capture. The agent handled it correctly on its own reflexes, keeping the secret out of the repository and advising rotation, but the schema did not prompt me to state it. I will not bolt on an eighth slot from one case. I will note the gap: as soon as a domain expert hands an agent anything sensitive - a token, a key, a position - there is a data-handling expectation that belongs in the specification, and slot 4 should probably be read more broadly than "what may you do to the device" to "what is the safety envelope, for the device and for my data both."</w:t>
+        <w:t>Six of seven slots transfer to a very different project unchanged, more than I expected, and the schema's core refusal held: I specified no field numbers, no projection math, no threading model, which are exactly the parts that had to be discovered or engineered. The seam is slot 4. On a read-only instrument the device-authorization framing goes slack, while a different concern - handling a credential I pasted into the conversation - turned out to matter and is not what slot 4 was built to capture. The agent handled it correctly on its own, but the schema did not prompt me to state it. From one case I will not add an eighth slot; I will note that as soon as a domain expert hands an agent anything sensitive, there is a data-handling expectation that belongs in the specification, and slot 4 should read as "what is the safety envelope, for the device and for my data both."</w:t>
       </w:r>
     </w:p>
     <w:p>
@@ -2111,7 +2106,7 @@
     </w:p>
     <w:p>
       <w:r>
-        <w:t>As before, I treat duration as effort in person-hours, not calendar time. The project's wall-clock span ran across two sessions over several days, but most of that was idle stretches waiting on my own availability, my own review, and, more than once, the dish dropping off the network and coming back. Effort is the quantity worth comparing.</w:t>
+        <w:t>I treat duration as effort in person-hours, not calendar time. The project's wall-clock span ran across two sessions over several days, but most of that was idle - waiting on my availability, my review, and the dish dropping off the network and coming back.</w:t>
       </w:r>
     </w:p>
     <w:p>
@@ -2129,12 +2124,12 @@
     </w:p>
     <w:p>
       <w:r>
-        <w:t>For the AI-coupled side I bound active effort from the record. The work landed across roughly two dozen short turns and the agent's bounded replies, with version-control timestamps showing increments minutes apart and a string of tagged releases, v1.0.0 through v1.0.5, marking the larger steps. This project was materially bigger than the first and ran longer, with more iteration and a great deal of live verification against a real dish. Active effort - agent generation plus my own reading and direction - comes to a few hours, call it three to four. I report it as an order-of-magnitude figure and round up on purpose, preferring to overstate the human-side cost of reviewing output than to understate it.</w:t>
+        <w:t>For the AI-coupled side I bound active effort from the record: roughly two dozen short turns and bounded replies, with version-control timestamps minutes apart and a string of releases marking the larger steps. This project was bigger than the first and ran longer, with more iteration and a great deal of live verification. Active effort - agent generation plus my reading and direction - comes to a few hours, call it three to four. I report it as an order-of-magnitude figure and round up, preferring to overstate the human-review cost than understate it.</w:t>
       </w:r>
     </w:p>
     <w:p>
       <w:r>
-        <w:t xml:space="preserve">For the unaided side there is again nothing to measure, so I estimate it. I break the artifact into nine components, give each a three-point estimate (optimistic </w:t>
+        <w:t xml:space="preserve">For the unaided side there is nothing to measure, so I estimate it. I break the artifact into nine components, give each a three-point estimate (optimistic </w:t>
       </w:r>
       <w:r>
         <w:rPr>
@@ -2161,7 +2156,7 @@
         <w:t>b</w:t>
       </w:r>
       <w:r>
-        <w:t xml:space="preserve">), and apply the PERT approximation: expected effort </w:t>
+        <w:t xml:space="preserve">), and apply the PERT approximation: </w:t>
       </w:r>
       <w:r>
         <w:rPr>
@@ -2197,7 +2192,7 @@
         <w:t>b</w:t>
       </w:r>
       <w:r>
-        <w:t xml:space="preserve">)/6, with standard deviation </w:t>
+        <w:t xml:space="preserve">)/6, </w:t>
       </w:r>
       <w:r>
         <w:rPr>
@@ -2224,7 +2219,7 @@
         <w:t>a</w:t>
       </w:r>
       <w:r>
-        <w:t>)/6, treating the components as independent so the total variance is the sum of the component variances. The baseline assumes a competent professional developer, which is generous given that the person who actually directed the work calls himself a non-programmer. Scope matches what was delivered: discovery, the satellite and mapping work, verification, reliability, and packaging are all in, not just the happy path.</w:t>
+        <w:t>)/6, with independent components so the total variance is the sum. The baseline assumes a competent professional, generous given that the person who directed the work calls himself a non-programmer. Scope matches what was delivered: discovery, the satellite and mapping work, verification, reliability, and packaging are all in.</w:t>
       </w:r>
     </w:p>
     <w:p>
@@ -3295,7 +3290,7 @@
               <w:rPr>
                 <w:sz w:val="20"/>
               </w:rPr>
-              <w:t>Packaging and publishing (repo, README, six releases, screenshots)</w:t>
+              <w:t>Packaging and publishing (repo, README, releases, screenshots)</w:t>
             </w:r>
           </w:p>
         </w:tc>
@@ -3488,7 +3483,7 @@
     </w:tbl>
     <w:p>
       <w:r>
-        <w:t xml:space="preserve">The components add up to an expected 40.3 person-hours with a standard deviation of 4.3 h (the total </w:t>
+        <w:t xml:space="preserve">The components total 40.3 person-hours with a standard deviation of 4.3 h (the total </w:t>
       </w:r>
       <w:r>
         <w:rPr>
@@ -3497,7 +3492,7 @@
         <w:t>σ</w:t>
       </w:r>
       <w:r>
-        <w:t xml:space="preserve"> is the root-sum-square of the component values); a normal approximation puts a 90% interval at roughly 33 to 47 hours, about a working week. The largest and shakiest lines are the two discovery-heavy ones: an unaided developer, without a quick probe-decode-and-distrust loop, has to work out on their own both that the field numbers have moved and, harder, that several plausible readings are lying, the same facts the agent established empirically in §2.</w:t>
+        <w:t xml:space="preserve"> is the root-sum-square of the components); a normal approximation puts a 90% interval at roughly 33 to 47 hours, about a working week. The largest and shakiest lines are the discovery-heavy ones: an unaided developer, without a quick probe-decode-and-distrust loop, has to work out alone both that the field numbers moved and, harder, that several plausible readings lie.</w:t>
       </w:r>
     </w:p>
     <w:p>
@@ -3515,7 +3510,7 @@
     </w:p>
     <w:p>
       <w:r>
-        <w:t>Against that baseline, the AI-coupled work produced a tested, published, six-release artifact in a few hours of active effort, an effort reduction on the order of ten-fold relative to an unaided professional - a smaller multiple than the first project's, and I think honestly so, because this artifact is larger and more of its bulk is ordinary interface and mapping code that a professional writes briskly. The comparison against my actual alternative is the same as before and sharper for being unquantifiable: I am not a developer. For me, building this unaided does not start at 40 hours; it starts with acquiring gRPC, protobuf wire formats, orbital mechanics, serial parsing, threading, and desktop UI before the real work begins, and its honest outcomes are some large multiple of the professional estimate or, more likely, non-completion. The operative comparison for someone like me is not "a few hours versus forty." It is "a working tool versus none."</w:t>
+        <w:t>Against that baseline, the AI-coupled work produced a tested, published, multi-release artifact in a few hours of active effort - an order-of-magnitude reduction, a smaller multiple than the first project's and honestly so, because this artifact is larger and more of its bulk is ordinary interface and mapping code a professional writes briskly. The comparison against my actual alternative is sharper for being unquantifiable: I am not a developer, and building this unaided does not start at 40 hours but with acquiring gRPC, protobuf, orbital mechanics, serial parsing, threading, and desktop UI before the real work begins. Its honest outcomes are some large multiple of the estimate, or non-completion. For someone like me the operative comparison is not "a few hours versus forty"; it is a working tool versus none.</w:t>
       </w:r>
     </w:p>
     <w:p>
@@ -3533,7 +3528,7 @@
     </w:p>
     <w:p>
       <w:r>
-        <w:t>The AI-coupled figure is an uninstrumented order-of-magnitude bound; the unaided figure is a modeled estimate, not a measurement, and three-point estimates drift with whatever the estimator anchors on. Both rest on n = 1, now alongside a second n = 1 rather than aggregated with it. The professional baseline could be conservative or generous depending on how much gRPC and orbital work the developer brings already; I widened the pessimistic discovery bounds to absorb some of that. And the ratio from one small instrument should not be stretched to large systems, where architecture and years of maintenance dominate and a conversation will not carry you. These figures describe single-purpose field instrumentation, where the method looks most advantageous, and not much beyond.</w:t>
+        <w:t>The AI-coupled figure is an uninstrumented order-of-magnitude bound; the unaided figure is a modeled estimate, not a measurement, and three-point estimates drift with the estimator's anchor. Both rest on n = 1, now beside a second n = 1 rather than aggregated with it. The professional baseline could run either way depending on how much gRPC and orbital work the developer brings; I widened the pessimistic discovery bounds to absorb some of that. And the ratio from one small instrument should not be stretched to large systems, where architecture and maintenance dominate. These figures describe single-purpose field instrumentation, and not much beyond.</w:t>
       </w:r>
     </w:p>
     <w:p>
@@ -3551,7 +3546,7 @@
     </w:p>
     <w:p>
       <w:r>
-        <w:t xml:space="preserve">The same division of labor showed up, and the second case strengthens it. The practitioner brings the </w:t>
+        <w:t xml:space="preserve">The division of labor held, and the second case strengthens it. The practitioner brings the </w:t>
       </w:r>
       <w:r>
         <w:rPr>
@@ -3578,7 +3573,7 @@
         <w:t>how</w:t>
       </w:r>
       <w:r>
-        <w:t xml:space="preserve">: the protocol framing, the orbital math, the interface, the threading - and, just as much, the </w:t>
+        <w:t xml:space="preserve"> - protocol framing, orbital math, interface, threading - and the </w:t>
       </w:r>
       <w:r>
         <w:rPr>
@@ -3587,22 +3582,22 @@
         <w:t>discovery</w:t>
       </w:r>
       <w:r>
-        <w:t xml:space="preserve"> of facts that can only be learned at runtime, including the uncomfortable ones where the device's own telemetry misleads. Every correction that no specification could have prevented - the moved field numbers, the two mismapped readings, the frozen sky-scan array, the wrong-tier credential - fell on the agent's side of that line, which is where the schema's refusal to ask users for implementation would put them.</w:t>
+        <w:t xml:space="preserve"> of facts learnable only at runtime, including the uncomfortable ones where the telemetry misleads. Every correction no specification could have prevented - the moved field numbers, the two mismapped readings, the frozen sky-scan array, the wrong-tier credential - fell on the agent's side of that line, where the schema's refusal to ask users for implementation would put them.</w:t>
       </w:r>
     </w:p>
     <w:p>
       <w:r>
-        <w:t>What the second case adds is a test of the schema rather than another argument for it, and the test came back mostly positive with one named seam. Six of seven slots transferred unchanged to a different device and a far larger artifact, and the verification slot in particular did heavy lifting precisely because this device's readings could not be taken at face value. The seam was slot 4: device-authorization went idle on a read-only instrument while a data-handling concern I did not anticipate - a credential in the conversation - turned out to matter, was handled well by the agent unprompted, and was not something the schema prompted me to state. That is a real finding from a real difference between the cases, not a flaw I went looking for.</w:t>
+        <w:t>What the second case adds is a test rather than another argument, and it came back mostly positive with one named seam. Six of seven slots transferred unchanged, and the verification slot did heavy lifting precisely because this device's readings could not be taken at face value. The seam was slot 4: device-authorization went idle on a read-only instrument while a data-handling concern I did not anticipate turned out to matter, was handled well by the agent unprompted, and was not something the schema prompted me to state.</w:t>
       </w:r>
     </w:p>
     <w:p>
       <w:r>
-        <w:t>The honesty caveats from the first paper still apply and one is sharper here. This is again n = 1, with no control and a user-and-agent pair I cannot claim is representative. Some apparent under-specification is again good practice; I could not have judged the need for a firmware guard's exact behavior before watching the field numbers' fragility, even if I could have named the requirement. And the schema leans hard on an agent that can actually do empirical discovery and distrust its own first reading - against a weaker system, slots 4 and 7 would give back much less, and the very thing that made this project work, refusing to believe a plausible number, is not something every tool will do.</w:t>
+        <w:t>The caveats from the first paper still apply, one sharper. This is again n = 1, with no control and a user-and-agent pair I cannot claim is representative. Some apparent under-specification is good practice - I could not have judged the firmware guard's exact behavior before watching the field numbers' fragility, even if I could have named the requirement. And the schema leans hard on an agent that can do empirical discovery and distrust its own first reading; against a weaker system, slots 4 and 7 would give back much less.</w:t>
       </w:r>
     </w:p>
     <w:p>
       <w:r>
-        <w:t>Future work is the same head-to-head I called for before, now with two grounding cases instead of one: paired tasks with and without the structured prompt, across several domain users and devices, measuring turns to acceptance, defect counts, instrumented time against matched unaided controls, and the share of corrections that trace to specification gaps versus discovery. With two cases pointing the same way, that study is more worth running, not less.</w:t>
+        <w:t>Future work is the same head-to-head I called for before, now with two grounding cases: paired tasks with and without the structured prompt, across several domain users and devices, measuring turns to acceptance, defect counts, instrumented time against matched unaided controls, and the share of corrections tracing to specification gaps versus discovery.</w:t>
       </w:r>
     </w:p>
     <w:p>
@@ -3620,7 +3615,7 @@
     </w:p>
     <w:p>
       <w:r>
-        <w:t>A field practitioner produced, debugged, hardened, and published a second operational device-monitoring application by conversation alone, leaning on domain knowledge rather than programming skill - this time against a device whose telemetry is not merely undocumented but, in places, actively misleading. The interaction compressed development effort by roughly an order of magnitude against an estimated unaided professional baseline, and for a non-programmer it again plausibly made the difference between a working tool and none. Reading the transcript back, the now-familiar split held: about half the turns supplied requirements latent in the original intent and could have been hoisted into a single pass, while the irreducible minority - the moved fields, the readings that lied, the wrong-tier credential - were discovery, and properly the agent's to carry. Most usefully, I could finally test the Domain-Expert Specification schema rather than only propose it, and six of its seven slots transferred to a markedly different project intact, with the one seam - a safety envelope for my data, not just the device - named honestly for the next revision. Two cases are not a validation. They are a second data point pointing the same direction as the first, which is reason enough to keep asking the question with proper controls, and to keep handing the discovery to the side that can actually do it.</w:t>
+        <w:t>A field practitioner produced, debugged, hardened, and published a second operational device-monitoring application by conversation alone, leaning on domain knowledge rather than programming skill - this time against a device whose telemetry is not merely undocumented but, in places, actively misleading. The interaction compressed effort by roughly an order of magnitude against an estimated unaided professional baseline, and for a non-programmer it again plausibly made the difference between a working tool and none. About half the turns supplied requirements latent in the original intent and could have been hoisted into a single pass; the irreducible minority were discovery, and properly the agent's to carry. Most usefully, I could finally test the Domain-Expert Specification schema rather than only propose it, and six of its seven slots transferred to a markedly different project, with the one seam - a safety envelope for my data, not just the device - named for the next revision. Two cases are not a validation. They are a second data point pointing the same direction as the first, which is reason enough to keep asking the question with proper controls, and to keep handing the discovery to the side that can actually do it.</w:t>
       </w:r>
     </w:p>
     <w:p>
@@ -3638,7 +3633,7 @@
     </w:p>
     <w:p>
       <w:r>
-        <w:t xml:space="preserve">The complete artifact, including the runtime-compiled gRPC client, the two-window interface, the satellite sky map, and the figure reproduced here, lives at </w:t>
+        <w:t xml:space="preserve">The complete artifact - the runtime-compiled gRPC client, the two-window interface, the satellite sky map, and the figure reproduced here - lives at </w:t>
       </w:r>
       <w:r>
         <w:rPr>
@@ -3647,7 +3642,7 @@
         <w:t>https://github.com/amcleodUNH/starlink-monitor</w:t>
       </w:r>
       <w:r>
-        <w:t xml:space="preserve"> under the MIT License, across tagged releases v1.0.0 through v1.0.5. The telemetry field mappings were established by wire-decoding the dish's own replies and were verified against the firmware build named in the application's </w:t>
+        <w:t xml:space="preserve"> under the MIT License, across tagged releases. The telemetry field mappings were established by wire-decoding the dish's own replies and verified against the firmware build named in the application's </w:t>
       </w:r>
       <w:r>
         <w:rPr>
@@ -3656,7 +3651,7 @@
         <w:t>KNOWN_FIRMWARE</w:t>
       </w:r>
       <w:r>
-        <w:t xml:space="preserve"> constant; the satellite look-angle math was cross-checked against an independent ephemeris library to within a fraction of a degree, and the mismapped fields described in §2 were identified by holding a decoded reading against a streamed value, a physically clear sky, or the same field on a later poll.</w:t>
+        <w:t xml:space="preserve"> constant; the satellite look-angle math was cross-checked against an independent ephemeris library to within a fraction of a degree, and the mismapped fields of §2 were identified by holding a decoded reading against a streamed value, a clear sky, or the same field on a later poll.</w:t>
       </w:r>
     </w:p>
     <w:p>
@@ -3674,7 +3669,7 @@
     </w:p>
     <w:p>
       <w:r>
-        <w:t>The software artifact and a draft of this paper were generated by an LLM coding agent (Claude, Anthropic) under the direction of the human author, whose inputs - reproduced and analyzed in §4 and §5 - were the specification. Most of the typing was not mine. The paper's self-referential reading of those inputs, and its grading of a schema the author co-proposed in the prior case, should be taken with that provenance in mind.</w:t>
+        <w:t>The software artifact and a draft of this paper were generated by an LLM coding agent (Claude, Anthropic) under the direction of the human author, whose inputs - reproduced and analyzed in §4 and §5 - were the specification. Most of the typing was not mine. The paper's self-referential reading of those inputs, and its grading of a schema the author co-proposed, should be taken with that provenance in mind.</w:t>
       </w:r>
     </w:p>
     <w:sectPr>

</xml_diff>

<commit_message>
Rewrite paper and summary under three writing principles
Apply the One Idea Rule (one idea per sentence; break the long semicolon/dash
chains apart), Cut the Clutter (drop hedges and meta-commentary), and Simplify
(plainer words, simpler structure) throughout both documents. Same substance,
facts, and tables; shorter, plainer sentences. Regenerate both .docx.

Co-Authored-By: Claude Opus 4.8 <noreply@anthropic.com>
</commit_message>
<xml_diff>
--- a/docs/starlink-monitor-case-study.docx
+++ b/docs/starlink-monitor-case-study.docx
@@ -79,7 +79,7 @@
     </w:p>
     <w:p>
       <w:r>
-        <w:t>This is a second case study in building a working tool by directing a coding agent, and a chance to test a pattern proposed in the first. The artifact is a standalone Python desktop dashboard that monitors a Starlink dish over its local gRPC interface, with live link metrics, a satellite sky map, GPS, on-disk logging, and a firmware guard; as before, I specified it in plain language and wrote none of the source. I am a marine instrumentation engineer, not a programmer. The hard part is again a single class of non-obvious fact, sharper here than a mislabeled protocol: the dish answers an undocumented gRPC API whose field numbers are shifted from the community spec and, worse, several readings are actively misleading - a buffer that looks like signal-to-noise but is not, a number that reads like an obstruction score but tracks something else, a panel that looks live but is frozen. None of it could be specified up front because none of it was known; each was settled only by wire-decoding the bytes and checking against ground truth. I again read the transcript as data, classify the turns, and then do what the first paper could only propose: I take the Domain-Expert Specification (DES) schema and ask whether it fits a different device, protocol, and a far larger artifact. Six of its seven slots transfer cleanly; the one seam is a data-handling concern the schema does not name. I again bound effort - a few hours of active attention against a three-point estimate near 40 person-hours for an unaided professional, and a different regime entirely for a non-programmer alone. One case again, observed and not controlled; the schema remains a hypothesis, now with a second data point.</w:t>
+        <w:t>This is a second case study. I built a working tool by directing a coding agent. The first case proposed a pattern; this one tests it. The tool is a Python desktop dashboard. It monitors a Starlink dish over the dish's local gRPC interface. It shows live link metrics, a satellite sky map, GPS, on-disk logging, and a firmware guard. I specified it in plain language. I wrote none of the source. I am a marine instrumentation engineer, not a programmer. The hard part is one class of fact, and it is sharper than a mislabeled protocol. The dish answers an undocumented gRPC API. Its field numbers are shifted from the community spec. Worse, several readings are misleading. A buffer looks like signal-to-noise but is not. A number reads like an obstruction score but tracks something else. A panel looks live but is frozen. None of this could be specified up front, because nobody knew it. Each was settled by decoding the bytes and checking against ground truth. I again read the transcript as data and classify the turns. Then I do what the first paper could not. I take the Domain-Expert Specification (DES) schema and test it on a different device, a different protocol, and a much larger artifact. Six of its seven slots transfer cleanly. The one seam is a data-handling concern the schema does not name. I again bound the effort. Active work took a few hours. A three-point estimate for an unaided professional is near 40 person-hours. For a non-programmer alone it is a different regime. This is one case, observed and not controlled. The schema stays a hypothesis, now with a second data point.</w:t>
       </w:r>
     </w:p>
     <w:p>
@@ -108,12 +108,12 @@
     </w:p>
     <w:p>
       <w:r>
-        <w:t>The first paper in this series described a practitioner specifying an operational tool in plain language and an agent building, debugging, hardening, and publishing it. It ended with a proposal rather than a result: a seven-slot prompting schema, the Domain-Expert Specification, offered as a hypothesis about how people who know their gear but not their compiler might reach a correct artifact in fewer passes. A hypothesis with one supporting case is a story, not a finding. This paper adds a second case, chosen to differ in nearly every dimension that matters - a different device, a protocol that is documented but wrong rather than merely hidden, and an artifact perhaps three times the size - and asks whether the same division of labor and the same schema hold up.</w:t>
+        <w:t>The first paper described a practitioner specifying an operational tool in plain language. An agent built it, debugged it, hardened it, and published it. The paper ended with a proposal, not a result. The proposal was a seven-slot prompting schema, the Domain-Expert Specification. It is a hypothesis: people who know their gear but not their compiler might reach a correct artifact in fewer passes. One supporting case is a story, not a finding. This paper adds a second case. I chose it to differ in nearly every dimension that matters. A different device. A protocol that is documented but wrong, not merely hidden. An artifact perhaps three times the size. The question is whether the same division of labor and the same schema hold up.</w:t>
       </w:r>
     </w:p>
     <w:p>
       <w:r>
-        <w:t>The setting is marine. A Starlink terminal is now the default over-the-horizon link on a working vessel or an uncrewed surface vehicle, and when the link degrades at sea you want to know why, locally, without an account login. I asked for a tool that watches the dish on the local network and shows me what it is doing. What came back, over roughly two dozen turns across two sessions, was a published desktop application with a live link view, a moving map of the satellites overhead, a GPS feed, telemetry logging, and a guard that warns me when the dish updates its own firmware out from under the field mappings the tool depends on. My aims are the two from before: record the artifact honestly, including the part that was genuinely hard, then read the transcript against the schema the last paper proposed and see what survives a second case.</w:t>
+        <w:t>The setting is marine. A Starlink terminal is now the default over-the-horizon link on a working vessel or an uncrewed surface vehicle. When the link degrades at sea, you want to know why, locally, without an account login. I asked for a tool that watches the dish on the local network and shows me what it is doing. It came back over roughly two dozen turns across two sessions. It is a published desktop application. It has a live link view, a moving map of the satellites overhead, a GPS feed, and telemetry logging. It also has a guard that warns me when the dish updates its own firmware. My aims are the two from before. Record the artifact honestly, including the hard part. Then read the transcript against the schema and see what survives a second case.</w:t>
       </w:r>
     </w:p>
     <w:p>
@@ -131,7 +131,7 @@
     </w:p>
     <w:p>
       <w:r>
-        <w:t xml:space="preserve">A Starlink terminal exposes a gRPC service on its local gateway, </w:t>
+        <w:t xml:space="preserve">A Starlink terminal exposes a gRPC service on its local gateway. The address is </w:t>
       </w:r>
       <w:r>
         <w:rPr>
@@ -149,17 +149,17 @@
         <w:t>9200</w:t>
       </w:r>
       <w:r>
-        <w:t>, with no authentication. That much is community knowledge. The trap has two layers.</w:t>
+        <w:t>. There is no authentication. That much is community knowledge. The trap has two layers.</w:t>
       </w:r>
     </w:p>
     <w:p>
       <w:r>
-        <w:t>The first is ordinary reverse engineering. The service is undocumented, and the field numbers community tools once relied on no longer match: in this firmware the telemetry fields sit roughly a thousand higher than the legacy spec, and they are not stable across firmware. So the agent rebuilt the schema from the wire - compiling a protobuf at runtime, calling the status and history methods, and walking the raw bytes until each reading lined up with something physical. Tedious but mechanical; off-the-shelf field maps do not survive a firmware bump, but a decoder does.</w:t>
+        <w:t>The first layer is ordinary reverse engineering. The service is undocumented. The field numbers community tools once used no longer match. In this firmware the telemetry fields sit about a thousand higher than the legacy spec. They are not stable across firmware. So the agent rebuilt the schema from the wire. It compiled a protobuf at runtime, called the status and history methods, and walked the raw bytes until each reading matched something physical. This is tedious but mechanical. Off-the-shelf field maps do not survive a firmware bump. A decoder does.</w:t>
       </w:r>
     </w:p>
     <w:p>
       <w:r>
-        <w:t>The second layer is the real lesson, and it is worse than a hidden protocol: several readings are not hidden at all, but present, plausible, and wrong, exposed only by watching them over time or against an independent truth.</w:t>
+        <w:t>The second layer is the real lesson. It is worse than a hidden protocol. Several readings are not hidden at all. They are present, plausible, and wrong. You catch them only by watching over time or against an independent truth.</w:t>
       </w:r>
     </w:p>
     <w:p>
@@ -167,7 +167,7 @@
         <w:pStyle w:val="ListBullet"/>
       </w:pPr>
       <w:r>
-        <w:t>A packed history buffer decodes as believable floats, and the obvious reading is "SNR history." It is not: against the live SNR the dish streams (steady near 16 to 20 dB), the buffer ran 16 to 89 with a mean near 32, and an SNR of 89 dB is not a thing. Seeding the SNR chart from it was showing fiction.</w:t>
+        <w:t>A packed history buffer decodes as believable floats. The obvious reading is "SNR history." It is not. The live SNR the dish streams holds near 16 to 20 dB. The buffer ran 16 to 89, with a mean near 32. An SNR of 89 dB is not a thing. Seeding the SNR chart from it showed fiction.</w:t>
       </w:r>
     </w:p>
     <w:p>
@@ -175,7 +175,7 @@
         <w:pStyle w:val="ListBullet"/>
       </w:pPr>
       <w:r>
-        <w:t>A field decodes as a tidy number between 0 and 1, exactly where an "obstruction score" belongs. Reported as one it made no sense: it read high under a provably clear sky and swung from 0.62 to 0.44 between polls seconds apart. Real obstruction does not do that; the field is an alignment metric, and the boolean that ought to carry obstruction is itself unreliable on this firmware.</w:t>
+        <w:t>A field decodes as a tidy number between 0 and 1. That is where an "obstruction score" belongs. Reported as one, it made no sense. It read high under a clear sky. It swung from 0.62 to 0.44 between polls seconds apart. Real obstruction does not do that. The field is an alignment metric. The boolean that should carry obstruction is itself unreliable here.</w:t>
       </w:r>
     </w:p>
     <w:p>
@@ -183,12 +183,12 @@
         <w:pStyle w:val="ListBullet"/>
       </w:pPr>
       <w:r>
-        <w:t>A ten-value array looked like a live per-sector signal map but never moved - byte-for-byte identical across eight polls in fourteen seconds while throughput and SNR changed normally. It is a slowly-accumulated sky scan that shifts over hours, not a per-second reading; the fix was relabeling it as what it is.</w:t>
+        <w:t>A ten-value array looked like a live per-sector signal map. It never moved. Eight polls in fourteen seconds returned identical values, while throughput and SNR changed normally. It is a slow sky scan that shifts over hours, not a per-second reading. The fix was to relabel it.</w:t>
       </w:r>
     </w:p>
     <w:p>
       <w:r>
-        <w:t>A hidden protocol you find by trying harder; a reading that lies you catch only by distrusting it, setting it beside a streamed value or a clear sky and watching for the contradiction. I could not have told the agent any of this up front: I did not know it, and the published field maps did not either. It had to be discovered by probing the box and refusing the first plausible answer, and that kind of discovery is a capability no wording on my end can supply.</w:t>
+        <w:t>You find a hidden protocol by trying harder. You catch a lying reading only by distrusting it. I could not have told the agent any of this up front. I did not know it. The published field maps did not either. It had to be discovered by probing the box and refusing the first plausible answer. That kind of discovery is a capability no wording on my end can supply.</w:t>
       </w:r>
     </w:p>
     <w:p>
@@ -215,7 +215,7 @@
         <w:t>starlink_dashboard.py</w:t>
       </w:r>
       <w:r>
-        <w:t>, that runs on the standard library plus the gRPC runtime, with two optional packages (</w:t>
+        <w:t xml:space="preserve">. It runs on the standard library plus the gRPC runtime. Two optional packages, </w:t>
       </w:r>
       <w:r>
         <w:rPr>
@@ -224,7 +224,7 @@
         <w:t>sgp4</w:t>
       </w:r>
       <w:r>
-        <w:t xml:space="preserve">, </w:t>
+        <w:t xml:space="preserve"> and </w:t>
       </w:r>
       <w:r>
         <w:rPr>
@@ -233,12 +233,12 @@
         <w:t>numpy</w:t>
       </w:r>
       <w:r>
-        <w:t>) used only by the satellite features and skipped gracefully when absent. One file keeps deployment on a vessel's console painless.</w:t>
+        <w:t>, drive the satellite features and are skipped when absent. One file keeps deployment on a vessel's console simple.</w:t>
       </w:r>
     </w:p>
     <w:p>
       <w:r>
-        <w:t>A client layer speaks the dish's gRPC dialect: it compiles the embedded protobuf at runtime (no build step, so a field map is a one-line edit and a relaunch), polls status every two seconds on a background thread, and marshals results to the interface safely. A main window shows the live link - download and upload, latency, packet loss, SNR, each with a sparkline - a twenty-minute throughput history with a hundred-sample mean, a status panel, and a location panel pairing an IP-derived ground-station estimate with the dish's GPS position, the distance between them, and a live scroll of the raw NMEA sentences. A detail window adds a satellite sky map: a top-down, dish-centered map drawn with real coastlines and borders, every Starlink satellite's ground point propagated with SGP4 so the field moves, the likely satellite highlighted, a fixed scale, a range ring, and a north indicator (Figure 1). Below it sit a per-sector map, a plain-language readout of the subsystem-ready flags, dish information including firmware and tilt, and extended info. Every poll appends to a daily CSV, schema-versioned so a new column never corrupts a day's file. A firmware check compares the dish's reported build against the one the mappings were verified on, turning the panel amber with a warning on a mismatch while continuing to run - which it earned in §4.</w:t>
+        <w:t>A client layer speaks the dish's gRPC dialect. It compiles the embedded protobuf at runtime, so a field map is a one-line edit and a relaunch. It polls status every two seconds on a background thread. It marshals results to the interface safely. A main window shows the live link: download, upload, latency, packet loss, and SNR, each with a sparkline. It also shows a twenty-minute throughput history with a hundred-sample mean, a status panel, and a location panel. The location panel pairs an IP-derived ground-station estimate with the dish's GPS position, the distance between them, and a live scroll of the raw NMEA sentences. A detail window adds a satellite sky map. The map is top-down and dish-centered, drawn with real coastlines and borders. Every Starlink satellite's ground point is propagated with SGP4, so the field moves. The likely satellite is highlighted. The map has a fixed scale, a range ring, and a north indicator (Figure 1). Below it sit a per-sector map, a plain-language readout of the subsystem-ready flags, dish information with firmware and tilt, and extended info. Every poll appends to a daily CSV. The CSV is schema-versioned, so a new column never corrupts a day's file. A firmware check compares the dish's reported build against the verified one. On a mismatch it turns the panel amber and warns, but keeps running. It earned that in §4.</w:t>
       </w:r>
     </w:p>
     <w:p>
@@ -303,79 +303,7 @@
     </w:p>
     <w:p>
       <w:r>
-        <w:t xml:space="preserve">The tool came together over roughly two dozen turns across two sessions. Table 1 condenses the significant ones and labels each by function, using the first paper's taxonomy: </w:t>
-      </w:r>
-      <w:r>
-        <w:rPr>
-          <w:i/>
-        </w:rPr>
-        <w:t>specification</w:t>
-      </w:r>
-      <w:r>
-        <w:t xml:space="preserve">, </w:t>
-      </w:r>
-      <w:r>
-        <w:rPr>
-          <w:i/>
-        </w:rPr>
-        <w:t>authorization</w:t>
-      </w:r>
-      <w:r>
-        <w:t xml:space="preserve">, </w:t>
-      </w:r>
-      <w:r>
-        <w:rPr>
-          <w:i/>
-        </w:rPr>
-        <w:t>defect report</w:t>
-      </w:r>
-      <w:r>
-        <w:t xml:space="preserve">, </w:t>
-      </w:r>
-      <w:r>
-        <w:rPr>
-          <w:i/>
-        </w:rPr>
-        <w:t>feature</w:t>
-      </w:r>
-      <w:r>
-        <w:t xml:space="preserve">, </w:t>
-      </w:r>
-      <w:r>
-        <w:rPr>
-          <w:i/>
-        </w:rPr>
-        <w:t>packaging</w:t>
-      </w:r>
-      <w:r>
-        <w:t xml:space="preserve">, </w:t>
-      </w:r>
-      <w:r>
-        <w:rPr>
-          <w:i/>
-        </w:rPr>
-        <w:t>deferral</w:t>
-      </w:r>
-      <w:r>
-        <w:t xml:space="preserve">, </w:t>
-      </w:r>
-      <w:r>
-        <w:rPr>
-          <w:i/>
-        </w:rPr>
-        <w:t>context</w:t>
-      </w:r>
-      <w:r>
-        <w:t xml:space="preserve">, and </w:t>
-      </w:r>
-      <w:r>
-        <w:rPr>
-          <w:i/>
-        </w:rPr>
-        <w:t>constraint</w:t>
-      </w:r>
-      <w:r>
-        <w:t>. Small layout and packaging turns are folded into the rows; the full transcript is longer than the table.</w:t>
+        <w:t>The tool came together over roughly two dozen turns across two sessions. Table 1 condenses the significant ones. It labels each by function, using the first paper's taxonomy: specification, authorization, defect report, feature, packaging, deferral, context, and constraint. Small layout and packaging turns are folded into the rows. The full transcript is longer than the table.</w:t>
       </w:r>
     </w:p>
     <w:p>
@@ -1827,7 +1755,7 @@
         <w:t>Turn 11, a knowledge defect surfaced by distrust.</w:t>
       </w:r>
       <w:r>
-        <w:t xml:space="preserve"> I reported that the SNR chart "appeared to lock up" and that the obstruction score "makes no sense" against a clear sky. Neither report was clever, and neither needed to be: the screen disagreed with the weather and with the live number beside it. From those two complaints the agent went back to the wire, set the buffered series next to the streamed SNR, polled the obstruction field and watched it swing, and found both had been mismapped by the spec it inherited. This is the analog of the first project's hidden Modbus dialect, irreducible in the same way - it rode on runtime evidence nobody had. I supplied not the answer but the suspicion, and the suspicion is what a domain expert carries.</w:t>
+        <w:t xml:space="preserve"> I reported that the SNR chart "appeared to lock up." Later I reported that the obstruction score "makes no sense" against a clear sky. Neither report was clever. Neither needed to be. The screen disagreed with the weather and with the live number beside it. The agent went back to the wire. It set the buffered series next to the streamed SNR. It polled the obstruction field and watched it swing. It found both fields had been mismapped by the spec it inherited. This is the analog of the first project's hidden Modbus dialect. It is irreducible in the same way: it rode on runtime evidence nobody had. I supplied the suspicion, not the answer. The suspicion is what a domain expert carries.</w:t>
       </w:r>
     </w:p>
     <w:p>
@@ -1838,7 +1766,7 @@
         <w:t>Turn 14, reliability the field then exercised for real.</w:t>
       </w:r>
       <w:r>
-        <w:t xml:space="preserve"> I asked for a firmware check: compare the dish's build to the verified one, warn on a mismatch, keep running. A sensible guard against a hypothetical. Days later the dish updated itself over the air, the guard turned the firmware line amber and kept running, the readings still agreed with reality, and we promoted the new build to "known." The requirement came from the destination rather than a present bug - a dish in the field updates on its own schedule, and a tool that silently trusts stale field numbers will lie the day it does.</w:t>
+        <w:t xml:space="preserve"> I asked for a firmware check. Compare the dish's build to the verified one, warn on a mismatch, keep running. It was a sensible guard against a hypothetical. Days later the dish updated itself over the air. The guard turned the firmware line amber and kept running. The readings still agreed with reality. We promoted the new build to "known." The requirement came from the destination, not a present bug. A dish in the field updates on its own schedule. A tool that trusts stale field numbers will lie the day it does.</w:t>
       </w:r>
     </w:p>
     <w:p>
@@ -1849,7 +1777,7 @@
         <w:t>Turn 7, a specification that hit a wall the agent diagnosed.</w:t>
       </w:r>
       <w:r>
-        <w:t xml:space="preserve"> I asked, mid-project, to rebuild against Starlink's V2 service-account API, and handed over a client id and secret. The agent authenticated and found the token scoped to the consumer tier, unable to reach the telemetry endpoints; "recode against the cloud API" became "you cannot, with this credential," established empirically, and we reverted. The dead end was found by trying, not guessing - and the agent, unprompted, kept the secret out of the source and the public repository and flagged that it should be rotated.</w:t>
+        <w:t xml:space="preserve"> Mid-project, I asked to rebuild against Starlink's V2 service-account API. I handed over a client id and secret. The agent authenticated. It found the token scoped to the consumer tier, with no access to the telemetry endpoints. "Recode against the cloud API" became "you cannot, with this credential." The agent found the dead end by trying, not guessing. It also kept the secret out of the source and the public repository, and flagged that it should be rotated.</w:t>
       </w:r>
     </w:p>
     <w:p>
@@ -1867,7 +1795,7 @@
     </w:p>
     <w:p>
       <w:r>
-        <w:t>Of the turns in Table 1, which were latent in my first intent and could have been hoisted into the opening pass, and which were genuinely irreducible?</w:t>
+        <w:t>Which turns were latent in my first intent? Which were genuinely irreducible?</w:t>
       </w:r>
     </w:p>
     <w:p>
@@ -1878,7 +1806,7 @@
         <w:t>The irreducible ones.</w:t>
       </w:r>
       <w:r>
-        <w:t xml:space="preserve"> Turn 1 (the seed) and turn 18 (this paper) are required by definition. Turn 11's discovery could only surface once the artifact ran and was watched against ground truth; the same holds for the protocol work behind turn 1 and the wrong-tier credential in turn 7. These are discovery, and discovery is the agent's to do.</w:t>
+        <w:t xml:space="preserve"> Turn 1, the seed, and turn 18, this paper, are required by definition. Turn 11's discovery could only surface once the artifact ran and was watched against ground truth. The same holds for the protocol work behind turn 1 and the wrong-tier credential in turn 7. These are discovery. Discovery is the agent's to do.</w:t>
       </w:r>
     </w:p>
     <w:p>
@@ -1889,7 +1817,7 @@
         <w:t>The avoidable ones.</w:t>
       </w:r>
       <w:r>
-        <w:t xml:space="preserve"> The GPS source and feed (turns 2, 12), the satellite map (turns 9, 16), publishing and the knowledge bundle (turns 5, 17), and the firmware guard (turn 14) each named something already in my intent but said only once its absence was in front of me. The firmware guard is the clearest: a dish in the field updates itself, so a tool keyed to firmware-specific field numbers must notice when the firmware changes - a non-functional requirement available on day one.</w:t>
+        <w:t xml:space="preserve"> Several turns named something already in my intent. The GPS source and feed (turns 2, 12). The satellite map (turns 9, 16). Publishing and the knowledge bundle (turns 5, 17). The firmware guard (turn 14). Each was said only once its absence was in front of me. The firmware guard is the clearest case. A dish in the field updates itself. A tool keyed to firmware-specific field numbers must notice when the firmware changes. That is a requirement I could have stated on day one.</w:t>
       </w:r>
     </w:p>
     <w:p>
@@ -1900,7 +1828,7 @@
         <w:t>A single-pass reconstruction.</w:t>
       </w:r>
       <w:r>
-        <w:t xml:space="preserve"> Fold the realized intent back into the seed and you get a request that, setting aside the irreducible discovery, could have produced substantially the final artifact in far fewer passes:</w:t>
+        <w:t xml:space="preserve"> Fold the realized intent back into the seed. Set aside the irreducible discovery. You get a request that could have produced most of the final artifact in far fewer passes:</w:t>
       </w:r>
     </w:p>
     <w:p>
@@ -1916,7 +1844,7 @@
     </w:p>
     <w:p>
       <w:r>
-        <w:t>I offer this not as a reproach to how the conversation went. Discovering your own requirements as you go is normal and often efficient, and a few of these I could not have judged before an artifact made the trade-off concrete. I offer it as evidence that a sizable share of the turns were latent in the first intent, and so could have been moved to the front.</w:t>
+        <w:t>I do not offer this as a reproach. Discovering your own requirements as you go is normal, and often efficient. A few of these I could not have judged before an artifact made the trade-off concrete. I offer it as evidence. A sizable share of the turns were latent in the first intent. They could have moved to the front.</w:t>
       </w:r>
     </w:p>
     <w:p>
@@ -1934,7 +1862,7 @@
     </w:p>
     <w:p>
       <w:r>
-        <w:t>The first paper proposed the DES schema and could only argue it would help. Here I apply it after the fact to a different project and grade each of its seven slots.</w:t>
+        <w:t>The first paper proposed the DES schema and could only argue it would help. Here I apply it after the fact to a different project. I grade each of its seven slots.</w:t>
       </w:r>
     </w:p>
     <w:p>
@@ -1963,7 +1891,7 @@
         <w:rPr>
           <w:i/>
         </w:rPr>
-        <w:t>Fits. Naming the address and transport pointed the agent at the right surface and bounded the protocol hunt from the first line.</w:t>
+        <w:t>Fits. Naming the address and transport pointed the agent at the right surface. It bounded the protocol hunt from the first line.</w:t>
       </w:r>
     </w:p>
     <w:p>
@@ -1977,13 +1905,13 @@
         <w:t>Operational repertoire.</w:t>
       </w:r>
       <w:r>
-        <w:t xml:space="preserve"> Watch the link metrics, pointing and obstruction, GPS, the satellites overhead; log it; survive a firmware change. </w:t>
+        <w:t xml:space="preserve"> Watch the link metrics, pointing and obstruction, GPS, and the satellites overhead. Log it. Survive a firmware change. </w:t>
       </w:r>
       <w:r>
         <w:rPr>
           <w:i/>
         </w:rPr>
-        <w:t>Fits, and again the slot I under-filled - the map and the logging were latent. It is also the one I am best placed to fill, being just the watch I want written down.</w:t>
+        <w:t>Fits. It is again the slot I under-filled; the map and the logging were latent. It is also the slot I am best placed to fill. It is just the watch I want written down.</w:t>
       </w:r>
     </w:p>
     <w:p>
@@ -1997,13 +1925,13 @@
         <w:t>Field context and deployment.</w:t>
       </w:r>
       <w:r>
-        <w:t xml:space="preserve"> A vessel or USV, an over-the-horizon link that matters operationally and degrades without warning. </w:t>
+        <w:t xml:space="preserve"> A vessel or USV. An over-the-horizon link that matters operationally and degrades without warning. </w:t>
       </w:r>
       <w:r>
         <w:rPr>
           <w:i/>
         </w:rPr>
-        <w:t>Fits, and it does real work: "the dish updates itself in the field" licenses the firmware guard.</w:t>
+        <w:t>Fits, and it does real work. "The dish updates itself in the field" licenses the firmware guard.</w:t>
       </w:r>
     </w:p>
     <w:p>
@@ -2017,13 +1945,13 @@
         <w:t>Authorization and safety envelope.</w:t>
       </w:r>
       <w:r>
-        <w:t xml:space="preserve"> Here is the strain. In the first project this meant "you may switch the relays, nothing is connected"; here the dish is live and read-only, so there was nothing to authorize and the slot fell idle. </w:t>
+        <w:t xml:space="preserve"> Here is the strain. In the first project this meant "you may switch the relays, nothing is connected." Here the dish is live and read-only. There was nothing to authorize, so the slot fell idle. </w:t>
       </w:r>
       <w:r>
         <w:rPr>
           <w:i/>
         </w:rPr>
-        <w:t>Mostly not applicable to a read-only instrument - and the safety concern that did matter was my data, which slot 4 does not name (see below).</w:t>
+        <w:t>It mostly does not apply to a read-only instrument. The safety concern that did matter was my data. Slot 4 does not name that.</w:t>
       </w:r>
     </w:p>
     <w:p>
@@ -2043,7 +1971,7 @@
         <w:rPr>
           <w:i/>
         </w:rPr>
-        <w:t>Fits. Naming the firmware build as a verified-against constant, not a hard assumption, is what made the guard possible instead of a silent breakage.</w:t>
+        <w:t>Fits. I named the firmware build as a verified-against constant, not a hard assumption. That made the guard possible instead of a silent breakage.</w:t>
       </w:r>
     </w:p>
     <w:p>
@@ -2063,7 +1991,7 @@
         <w:rPr>
           <w:i/>
         </w:rPr>
-        <w:t>Fits, and stating it first would have collapsed several packaging turns into the opening pass.</w:t>
+        <w:t>Fits. Stating it first would have collapsed several packaging turns into the opening pass.</w:t>
       </w:r>
     </w:p>
     <w:p>
@@ -2077,18 +2005,18 @@
         <w:t>Verification expectation.</w:t>
       </w:r>
       <w:r>
-        <w:t xml:space="preserve"> Verify against reality - the streamed value, the clear sky, the same field one poll later - and against an independent model where ground truth is thin. </w:t>
+        <w:t xml:space="preserve"> Verify against reality: the streamed value, the clear sky, the same field one poll later. Verify against an independent model where ground truth is thin. </w:t>
       </w:r>
       <w:r>
         <w:rPr>
           <w:i/>
         </w:rPr>
-        <w:t>Fits, and it earned the most here: the satellite math was checked against an independent ephemeris library to a fraction of a degree, and the mismapped fields were caught by holding a reading against a streamed truth. This slot is the whole game when the device's own readings cannot be trusted.</w:t>
+        <w:t>Fits, and it earned the most here. The satellite math was checked against an independent ephemeris library to a fraction of a degree. The mismapped fields were caught by holding a reading against a streamed truth. This slot is the whole game when the device's own readings cannot be trusted.</w:t>
       </w:r>
     </w:p>
     <w:p>
       <w:r>
-        <w:t>Six of seven slots transfer to a very different project unchanged, more than I expected, and the schema's core refusal held: I specified no field numbers, no projection math, no threading model, which are exactly the parts that had to be discovered or engineered. The seam is slot 4. On a read-only instrument the device-authorization framing goes slack, while a different concern - handling a credential I pasted into the conversation - turned out to matter and is not what slot 4 was built to capture. The agent handled it correctly on its own, but the schema did not prompt me to state it. From one case I will not add an eighth slot; I will note that as soon as a domain expert hands an agent anything sensitive, there is a data-handling expectation that belongs in the specification, and slot 4 should read as "what is the safety envelope, for the device and for my data both."</w:t>
+        <w:t>Six of seven slots transfer to a very different project unchanged. The schema's core refusal held. I specified no field numbers, no projection math, no threading model. Those are exactly the parts that had to be discovered or engineered. The seam is slot 4. On a read-only instrument the device-authorization framing goes slack. A different concern took its place: handling a credential I pasted into the conversation. That is not what slot 4 was built to capture. The agent handled it correctly on its own. The schema did not prompt me to state it. From one case I will not add an eighth slot. But the point stands. When a domain expert hands an agent anything sensitive, there is a data-handling expectation. It belongs in the specification. Slot 4 should read as "what is the safety envelope, for the device and for my data both."</w:t>
       </w:r>
     </w:p>
     <w:p>
@@ -2106,7 +2034,7 @@
     </w:p>
     <w:p>
       <w:r>
-        <w:t>I treat duration as effort in person-hours, not calendar time. The project's wall-clock span ran across two sessions over several days, but most of that was idle - waiting on my availability, my review, and the dish dropping off the network and coming back.</w:t>
+        <w:t>I treat duration as effort in person-hours, not calendar time. The wall-clock span ran across two sessions over several days. Most of that was idle. I was waiting on my availability, my review, and the dish dropping off the network and coming back.</w:t>
       </w:r>
     </w:p>
     <w:p>
@@ -2124,12 +2052,12 @@
     </w:p>
     <w:p>
       <w:r>
-        <w:t>For the AI-coupled side I bound active effort from the record: roughly two dozen short turns and bounded replies, with version-control timestamps minutes apart and a string of releases marking the larger steps. This project was bigger than the first and ran longer, with more iteration and a great deal of live verification. Active effort - agent generation plus my reading and direction - comes to a few hours, call it three to four. I report it as an order-of-magnitude figure and round up, preferring to overstate the human-review cost than understate it.</w:t>
+        <w:t>For the AI-coupled side I bound active effort from the record. The work ran across roughly two dozen short turns and bounded replies. Version-control timestamps land minutes apart. A string of releases marks the larger steps. This project was bigger than the first and ran longer. It had more iteration and a great deal of live verification. Active effort, meaning agent generation plus my reading and direction, comes to a few hours. Call it three to four. I report it as an order-of-magnitude figure and round up. I would rather overstate the human-review cost than understate it.</w:t>
       </w:r>
     </w:p>
     <w:p>
       <w:r>
-        <w:t xml:space="preserve">For the unaided side there is nothing to measure, so I estimate it. I break the artifact into nine components, give each a three-point estimate (optimistic </w:t>
+        <w:t xml:space="preserve">For the unaided side there is nothing to measure. So I estimate it. I break the artifact into nine components. I give each a three-point estimate: optimistic </w:t>
       </w:r>
       <w:r>
         <w:rPr>
@@ -2156,7 +2084,7 @@
         <w:t>b</w:t>
       </w:r>
       <w:r>
-        <w:t xml:space="preserve">), and apply the PERT approximation: </w:t>
+        <w:t xml:space="preserve">. I apply the PERT approximation: </w:t>
       </w:r>
       <w:r>
         <w:rPr>
@@ -2192,7 +2120,7 @@
         <w:t>b</w:t>
       </w:r>
       <w:r>
-        <w:t xml:space="preserve">)/6, </w:t>
+        <w:t xml:space="preserve">)/6, and </w:t>
       </w:r>
       <w:r>
         <w:rPr>
@@ -2219,7 +2147,7 @@
         <w:t>a</w:t>
       </w:r>
       <w:r>
-        <w:t>)/6, with independent components so the total variance is the sum. The baseline assumes a competent professional, generous given that the person who directed the work calls himself a non-programmer. Scope matches what was delivered: discovery, the satellite and mapping work, verification, reliability, and packaging are all in.</w:t>
+        <w:t>)/6. The components are independent, so the total variance is the sum. The baseline assumes a competent professional. That is generous, since the person who directed the work calls himself a non-programmer. Scope matches what was delivered. Discovery, the satellite and mapping work, verification, reliability, and packaging are all in.</w:t>
       </w:r>
     </w:p>
     <w:p>
@@ -3483,7 +3411,7 @@
     </w:tbl>
     <w:p>
       <w:r>
-        <w:t xml:space="preserve">The components total 40.3 person-hours with a standard deviation of 4.3 h (the total </w:t>
+        <w:t xml:space="preserve">The components total 40.3 person-hours, with a standard deviation of 4.3 h. The total </w:t>
       </w:r>
       <w:r>
         <w:rPr>
@@ -3492,7 +3420,7 @@
         <w:t>σ</w:t>
       </w:r>
       <w:r>
-        <w:t xml:space="preserve"> is the root-sum-square of the components); a normal approximation puts a 90% interval at roughly 33 to 47 hours, about a working week. The largest and shakiest lines are the discovery-heavy ones: an unaided developer, without a quick probe-decode-and-distrust loop, has to work out alone both that the field numbers moved and, harder, that several plausible readings lie.</w:t>
+        <w:t xml:space="preserve"> is the root-sum-square of the components. A normal approximation puts a 90% interval at roughly 33 to 47 hours. That is about a working week. The largest and shakiest lines are the discovery-heavy ones. An unaided developer has no quick probe-decode-and-distrust loop. They must work out alone that the field numbers moved. Harder still, they must work out that several plausible readings lie.</w:t>
       </w:r>
     </w:p>
     <w:p>
@@ -3510,7 +3438,7 @@
     </w:p>
     <w:p>
       <w:r>
-        <w:t>Against that baseline, the AI-coupled work produced a tested, published, multi-release artifact in a few hours of active effort - an order-of-magnitude reduction, a smaller multiple than the first project's and honestly so, because this artifact is larger and more of its bulk is ordinary interface and mapping code a professional writes briskly. The comparison against my actual alternative is sharper for being unquantifiable: I am not a developer, and building this unaided does not start at 40 hours but with acquiring gRPC, protobuf, orbital mechanics, serial parsing, threading, and desktop UI before the real work begins. Its honest outcomes are some large multiple of the estimate, or non-completion. For someone like me the operative comparison is not "a few hours versus forty"; it is a working tool versus none.</w:t>
+        <w:t>Against that baseline, the AI-coupled work produced a tested, published, multi-release artifact in a few hours. That is an order-of-magnitude reduction. It is a smaller multiple than the first project's, and honestly so. This artifact is larger. More of its bulk is ordinary interface and mapping code, which a professional writes briskly. The comparison against my actual alternative is sharper for being unquantifiable. I am not a developer. Building this unaided does not start at 40 hours. It starts with acquiring gRPC, protobuf, orbital mechanics, serial parsing, threading, and desktop UI. Only then does the real work begin. The honest outcomes are some large multiple of the estimate, or non-completion. For someone like me the comparison is not "a few hours versus forty." It is a working tool versus none.</w:t>
       </w:r>
     </w:p>
     <w:p>
@@ -3528,7 +3456,7 @@
     </w:p>
     <w:p>
       <w:r>
-        <w:t>The AI-coupled figure is an uninstrumented order-of-magnitude bound; the unaided figure is a modeled estimate, not a measurement, and three-point estimates drift with the estimator's anchor. Both rest on n = 1, now beside a second n = 1 rather than aggregated with it. The professional baseline could run either way depending on how much gRPC and orbital work the developer brings; I widened the pessimistic discovery bounds to absorb some of that. And the ratio from one small instrument should not be stretched to large systems, where architecture and maintenance dominate. These figures describe single-purpose field instrumentation, and not much beyond.</w:t>
+        <w:t>The AI-coupled figure is an uninstrumented order-of-magnitude bound. The unaided figure is a modeled estimate, not a measurement. Three-point estimates drift with the estimator's anchor. Both rest on n = 1. They sit beside a second n = 1, not aggregated with it. The professional baseline could run either way. It depends on how much gRPC and orbital work the developer already brings. I widened the pessimistic discovery bounds to absorb some of that. The ratio from one small instrument should not stretch to large systems. There, architecture and maintenance dominate. These figures describe single-purpose field instrumentation, and not much beyond.</w:t>
       </w:r>
     </w:p>
     <w:p>
@@ -3546,58 +3474,22 @@
     </w:p>
     <w:p>
       <w:r>
-        <w:t xml:space="preserve">The division of labor held, and the second case strengthens it. The practitioner brings the </w:t>
-      </w:r>
-      <w:r>
-        <w:rPr>
-          <w:i/>
-        </w:rPr>
-        <w:t>what</w:t>
-      </w:r>
-      <w:r>
-        <w:t xml:space="preserve"> and the </w:t>
-      </w:r>
-      <w:r>
-        <w:rPr>
-          <w:i/>
-        </w:rPr>
-        <w:t>why</w:t>
-      </w:r>
-      <w:r>
-        <w:t xml:space="preserve">: the device, the watch I want to stand, where it is going, what "done" looks like, and the suspicion that a reading is wrong. The agent brings the </w:t>
-      </w:r>
-      <w:r>
-        <w:rPr>
-          <w:i/>
-        </w:rPr>
-        <w:t>how</w:t>
-      </w:r>
-      <w:r>
-        <w:t xml:space="preserve"> - protocol framing, orbital math, interface, threading - and the </w:t>
-      </w:r>
-      <w:r>
-        <w:rPr>
-          <w:i/>
-        </w:rPr>
-        <w:t>discovery</w:t>
-      </w:r>
-      <w:r>
-        <w:t xml:space="preserve"> of facts learnable only at runtime, including the uncomfortable ones where the telemetry misleads. Every correction no specification could have prevented - the moved field numbers, the two mismapped readings, the frozen sky-scan array, the wrong-tier credential - fell on the agent's side of that line, where the schema's refusal to ask users for implementation would put them.</w:t>
+        <w:t>The division of labor held. The second case strengthens it. The practitioner brings the what and the why: the device, the watch I want to stand, where it is going, what "done" looks like, and the suspicion that a reading is wrong. The agent brings the how: protocol framing, orbital math, interface, and threading. The agent also brings discovery, the facts you can only learn at runtime. That includes the uncomfortable facts, where the telemetry misleads. No specification could have prevented the key corrections. The moved field numbers. The two mismapped readings. The frozen sky-scan array. The wrong-tier credential. All fell on the agent's side of the line. That is where the schema's refusal to ask users for implementation would put them.</w:t>
       </w:r>
     </w:p>
     <w:p>
       <w:r>
-        <w:t>What the second case adds is a test rather than another argument, and it came back mostly positive with one named seam. Six of seven slots transferred unchanged, and the verification slot did heavy lifting precisely because this device's readings could not be taken at face value. The seam was slot 4: device-authorization went idle on a read-only instrument while a data-handling concern I did not anticipate turned out to matter, was handled well by the agent unprompted, and was not something the schema prompted me to state.</w:t>
+        <w:t>The second case adds a test, not another argument. It came back mostly positive, with one named seam. Six of seven slots transferred unchanged. The verification slot did heavy lifting, because this device's readings could not be taken at face value. The seam was slot 4. Device-authorization went idle on a read-only instrument. A data-handling concern took its place. The agent handled it well, unprompted. The schema did not prompt me to state it.</w:t>
       </w:r>
     </w:p>
     <w:p>
       <w:r>
-        <w:t>The caveats from the first paper still apply, one sharper. This is again n = 1, with no control and a user-and-agent pair I cannot claim is representative. Some apparent under-specification is good practice - I could not have judged the firmware guard's exact behavior before watching the field numbers' fragility, even if I could have named the requirement. And the schema leans hard on an agent that can do empirical discovery and distrust its own first reading; against a weaker system, slots 4 and 7 would give back much less.</w:t>
+        <w:t>The caveats from the first paper still apply. One is sharper. This is again n = 1, with no control. The user-and-agent pair is not one I can call representative. Some apparent under-specification is good practice. I could not have judged the firmware guard's exact behavior before watching the field numbers' fragility. I could have named the requirement, though. The schema also leans hard on a capable agent. It needs one that can do empirical discovery and distrust its own first reading. Against a weaker system, slots 4 and 7 give back much less.</w:t>
       </w:r>
     </w:p>
     <w:p>
       <w:r>
-        <w:t>Future work is the same head-to-head I called for before, now with two grounding cases: paired tasks with and without the structured prompt, across several domain users and devices, measuring turns to acceptance, defect counts, instrumented time against matched unaided controls, and the share of corrections tracing to specification gaps versus discovery.</w:t>
+        <w:t>Future work is the head-to-head I called for before. Now it has two grounding cases. Run paired tasks, with and without the structured prompt, across several domain users and devices. Measure turns to acceptance, defect counts, and instrumented time against matched unaided controls. Measure the share of corrections that trace to specification gaps versus discovery.</w:t>
       </w:r>
     </w:p>
     <w:p>
@@ -3615,7 +3507,7 @@
     </w:p>
     <w:p>
       <w:r>
-        <w:t>A field practitioner produced, debugged, hardened, and published a second operational device-monitoring application by conversation alone, leaning on domain knowledge rather than programming skill - this time against a device whose telemetry is not merely undocumented but, in places, actively misleading. The interaction compressed effort by roughly an order of magnitude against an estimated unaided professional baseline, and for a non-programmer it again plausibly made the difference between a working tool and none. About half the turns supplied requirements latent in the original intent and could have been hoisted into a single pass; the irreducible minority were discovery, and properly the agent's to carry. Most usefully, I could finally test the Domain-Expert Specification schema rather than only propose it, and six of its seven slots transferred to a markedly different project, with the one seam - a safety envelope for my data, not just the device - named for the next revision. Two cases are not a validation. They are a second data point pointing the same direction as the first, which is reason enough to keep asking the question with proper controls, and to keep handing the discovery to the side that can actually do it.</w:t>
+        <w:t>A field practitioner produced, debugged, hardened, and published a second operational device-monitoring application by conversation alone. The work leaned on domain knowledge, not programming skill. This time the device's telemetry was not merely undocumented. In places it was actively misleading. The interaction compressed effort by roughly an order of magnitude against an estimated professional baseline. For a non-programmer, it again plausibly made the difference between a working tool and none. About half the turns supplied requirements latent in the original intent. Those could have been hoisted into a single pass. The irreducible minority were discovery, and properly the agent's to carry. Most usefully, I could finally test the DES schema, not just propose it. Six of its seven slots transferred to a markedly different project. The one seam, a safety envelope for my data, is named for the next revision. Two cases are not a validation. They are a second data point pointing the same direction as the first. That is reason enough to keep asking the question with proper controls. And to keep handing the discovery to the side that can actually do it.</w:t>
       </w:r>
     </w:p>
     <w:p>
@@ -3633,7 +3525,7 @@
     </w:p>
     <w:p>
       <w:r>
-        <w:t xml:space="preserve">The complete artifact - the runtime-compiled gRPC client, the two-window interface, the satellite sky map, and the figure reproduced here - lives at </w:t>
+        <w:t xml:space="preserve">The complete artifact lives at </w:t>
       </w:r>
       <w:r>
         <w:rPr>
@@ -3642,7 +3534,7 @@
         <w:t>https://github.com/amcleodUNH/starlink-monitor</w:t>
       </w:r>
       <w:r>
-        <w:t xml:space="preserve"> under the MIT License, across tagged releases. The telemetry field mappings were established by wire-decoding the dish's own replies and verified against the firmware build named in the application's </w:t>
+        <w:t xml:space="preserve"> under the MIT License, across tagged releases. It includes the runtime-compiled gRPC client, the two-window interface, and the satellite sky map. The telemetry field mappings were established by wire-decoding the dish's own replies. They were verified against the firmware build named in the application's </w:t>
       </w:r>
       <w:r>
         <w:rPr>
@@ -3651,7 +3543,7 @@
         <w:t>KNOWN_FIRMWARE</w:t>
       </w:r>
       <w:r>
-        <w:t xml:space="preserve"> constant; the satellite look-angle math was cross-checked against an independent ephemeris library to within a fraction of a degree, and the mismapped fields of §2 were identified by holding a decoded reading against a streamed value, a clear sky, or the same field on a later poll.</w:t>
+        <w:t xml:space="preserve"> constant. The satellite look-angle math was cross-checked against an independent ephemeris library, to within a fraction of a degree. The mismapped fields of §2 were identified by holding a decoded reading against a streamed value, a clear sky, or the same field on a later poll.</w:t>
       </w:r>
     </w:p>
     <w:p>
@@ -3669,7 +3561,7 @@
     </w:p>
     <w:p>
       <w:r>
-        <w:t>The software artifact and a draft of this paper were generated by an LLM coding agent (Claude, Anthropic) under the direction of the human author, whose inputs - reproduced and analyzed in §4 and §5 - were the specification. Most of the typing was not mine. The paper's self-referential reading of those inputs, and its grading of a schema the author co-proposed, should be taken with that provenance in mind.</w:t>
+        <w:t>The software artifact and a draft of this paper were generated by an LLM coding agent (Claude, Anthropic), under the direction of the human author. His inputs were the specification; §4 and §5 reproduce and analyze them. Most of the typing was not mine. The paper reads those inputs back, and grades a schema the author co-proposed. Take that provenance into account.</w:t>
       </w:r>
     </w:p>
     <w:sectPr>

</xml_diff>

<commit_message>
Repoint repository to the renamed GitHub account; update doc links
The account was renamed, so the repository URL changed. Update the artifact links
in the case-study paper and one-page summary (md + regenerated docx). Remote origin
repointed accordingly.

Co-Authored-By: Claude Opus 4.8 <noreply@anthropic.com>
</commit_message>
<xml_diff>
--- a/docs/starlink-monitor-case-study.docx
+++ b/docs/starlink-monitor-case-study.docx
@@ -61,7 +61,7 @@
         <w:rPr>
           <w:color w:val="1A5FB4"/>
         </w:rPr>
-        <w:t>https://github.com/amcleodUNH/starlink-monitor</w:t>
+        <w:t>https://github.com/AndyMcLeod/starlink-monitor</w:t>
       </w:r>
     </w:p>
     <w:p>
@@ -3531,7 +3531,7 @@
         <w:rPr>
           <w:color w:val="1A5FB4"/>
         </w:rPr>
-        <w:t>https://github.com/amcleodUNH/starlink-monitor</w:t>
+        <w:t>https://github.com/AndyMcLeod/starlink-monitor</w:t>
       </w:r>
       <w:r>
         <w:t xml:space="preserve"> under the MIT License, across tagged releases. It includes the runtime-compiled gRPC client, the two-window interface, and the satellite sky map. The telemetry field mappings were established by wire-decoding the dish's own replies. They were verified against the firmware build named in the application's </w:t>

</xml_diff>

<commit_message>
docs: fold the beam-handoff step into the case study and summary
Add Table 1 turn 19 (the dish's fixed 15 s satellite-handoff schedule, a device
fact the local API never reports) plus a §4 note framing it as domain knowledge
the expert supplies rather than the agent discovers; mirror it in the one-page
summary and mention the handoff-aligned estimate in §3. Regenerate both .docx.

Co-Authored-By: Claude Opus 4.8 <noreply@anthropic.com>
</commit_message>
<xml_diff>
--- a/docs/starlink-monitor-case-study.docx
+++ b/docs/starlink-monitor-case-study.docx
@@ -238,7 +238,7 @@
     </w:p>
     <w:p>
       <w:r>
-        <w:t>A client layer speaks the dish's gRPC dialect. It compiles the embedded protobuf at runtime, so a field map is a one-line edit and a relaunch. It polls status every two seconds on a background thread. It marshals results to the interface safely. A main window shows the live link: download, upload, latency, packet loss, and SNR, each with a sparkline. It also shows a twenty-minute throughput history with a hundred-sample mean, a status panel, and a location panel. The location panel pairs an IP-derived ground-station estimate with the dish's GPS position, the distance between them, and a live scroll of the raw NMEA sentences. A detail window adds a satellite sky map. The map is top-down and dish-centered, drawn with real coastlines and borders. Every Starlink satellite's ground point is propagated with SGP4, so the field moves. The likely satellite is highlighted. The map has a fixed scale, a range ring, and a north indicator (Figure 1). Below it sit a per-sector map, a plain-language readout of the subsystem-ready flags, dish information with firmware and tilt, and extended info. Every poll appends to a daily CSV. The CSV is schema-versioned, so a new column never corrupts a day's file. A firmware check compares the dish's reported build against the verified one. On a mismatch it turns the panel amber and warns, but keeps running. It earned that in §4.</w:t>
+        <w:t>A client layer speaks the dish's gRPC dialect. It compiles the embedded protobuf at runtime, so a field map is a one-line edit and a relaunch. It polls status every two seconds on a background thread. It marshals results to the interface safely. A main window shows the live link: download, upload, latency, packet loss, and SNR, each with a sparkline. It also shows a twenty-minute throughput history with a hundred-sample mean, a status panel, and a location panel. The location panel pairs an IP-derived ground-station estimate with the dish's GPS position, the distance between them, and a live scroll of the raw NMEA sentences. A detail window adds a satellite sky map. The map is top-down and dish-centered, drawn with real coastlines and borders. Every Starlink satellite's ground point is propagated with SGP4, so the field moves. The likely satellite is highlighted. The estimate follows the dish's fifteen-second handoff schedule and counts down to the next switch. The map has a fixed scale, a range ring, and a north indicator (Figure 1). Below it sit a per-sector map, a plain-language readout of the subsystem-ready flags, dish information with firmware and tilt, and extended info. Every poll appends to a daily CSV. The CSV is schema-versioned, so a new column never corrupts a day's file. A firmware check compares the dish's reported build against the verified one. On a mismatch it turns the panel amber and warns, but keeps running. It earned that in §4.</w:t>
       </w:r>
     </w:p>
     <w:p>
@@ -1741,6 +1741,80 @@
           </w:p>
         </w:tc>
       </w:tr>
+      <w:tr>
+        <w:tc>
+          <w:tcPr>
+            <w:tcW w:type="dxa" w:w="2340"/>
+          </w:tcPr>
+          <w:p>
+            <w:r>
+              <w:rPr>
+                <w:sz w:val="20"/>
+              </w:rPr>
+            </w:r>
+            <w:r>
+              <w:rPr>
+                <w:sz w:val="20"/>
+              </w:rPr>
+              <w:t>19</w:t>
+            </w:r>
+          </w:p>
+        </w:tc>
+        <w:tc>
+          <w:tcPr>
+            <w:tcW w:type="dxa" w:w="2340"/>
+          </w:tcPr>
+          <w:p>
+            <w:r>
+              <w:rPr>
+                <w:sz w:val="20"/>
+              </w:rPr>
+            </w:r>
+            <w:r>
+              <w:rPr>
+                <w:sz w:val="20"/>
+              </w:rPr>
+              <w:t>The dish re-selects its satellite every 15 s, on a fixed grid anchored 12 s past the minute; fold that into the estimate</w:t>
+            </w:r>
+          </w:p>
+        </w:tc>
+        <w:tc>
+          <w:tcPr>
+            <w:tcW w:type="dxa" w:w="2340"/>
+          </w:tcPr>
+          <w:p>
+            <w:r>
+              <w:rPr>
+                <w:sz w:val="20"/>
+              </w:rPr>
+            </w:r>
+            <w:r>
+              <w:rPr>
+                <w:sz w:val="20"/>
+              </w:rPr>
+              <w:t>Feature (domain knowledge)</w:t>
+            </w:r>
+          </w:p>
+        </w:tc>
+        <w:tc>
+          <w:tcPr>
+            <w:tcW w:type="dxa" w:w="2340"/>
+          </w:tcPr>
+          <w:p>
+            <w:r>
+              <w:rPr>
+                <w:sz w:val="20"/>
+              </w:rPr>
+            </w:r>
+            <w:r>
+              <w:rPr>
+                <w:sz w:val="20"/>
+              </w:rPr>
+              <w:t>Estimator phase-locked to the handoff grid, with a live countdown to the next handoff</w:t>
+            </w:r>
+          </w:p>
+        </w:tc>
+      </w:tr>
     </w:tbl>
     <w:p>
       <w:r>
@@ -1778,6 +1852,17 @@
       </w:r>
       <w:r>
         <w:t xml:space="preserve"> Mid-project, I asked to rebuild against Starlink's V2 service-account API. I handed over a client id and secret. The agent authenticated. It found the token scoped to the consumer tier, with no access to the telemetry endpoints. "Recode against the cloud API" became "you cannot, with this credential." The agent found the dead end by trying, not guessing. It also kept the secret out of the source and the public repository, and flagged that it should be rotated.</w:t>
+      </w:r>
+    </w:p>
+    <w:p>
+      <w:r>
+        <w:rPr>
+          <w:b/>
+        </w:rPr>
+        <w:t>Turn 19, domain knowledge the box will not reveal.</w:t>
+      </w:r>
+      <w:r>
+        <w:t xml:space="preserve"> The three turns above are discovery, and the agent's to carry. This one runs the other way. The dish re-selects its serving satellite every fifteen seconds. The schedule is fixed. It starts twelve seconds past the minute. The local API never says so. No amount of wire-decoding recovers it, because the dish does not report it. I brought the fact. The agent aligned the estimate to it: re-match once per window on that phase, then count down to the next handoff. This is the division of labor in miniature. Discovery is the agent's. A fact known only from outside the box is mine.</w:t>
       </w:r>
     </w:p>
     <w:p>

</xml_diff>